<commit_message>
docs: Actualizacion de sprints
</commit_message>
<xml_diff>
--- a/DOCUMENTACIÓN/Historias de Usuario_Tecnicas_Sprints Version IV.docx
+++ b/DOCUMENTACIÓN/Historias de Usuario_Tecnicas_Sprints Version IV.docx
@@ -14,15 +14,7 @@
       </w:r>
       <w:proofErr w:type="spellEnd"/>
       <w:r>
-        <w:t xml:space="preserve"> Backlog 12 </w:t>
-      </w:r>
-      <w:proofErr w:type="spellStart"/>
-      <w:r>
-        <w:t>Sprints</w:t>
-      </w:r>
-      <w:proofErr w:type="spellEnd"/>
-      <w:r>
-        <w:t xml:space="preserve"> </w:t>
+        <w:t xml:space="preserve"> Backlog 12 Sprints </w:t>
       </w:r>
     </w:p>
     <w:p>
@@ -59,7 +51,6 @@
         <w:tblCellMar>
           <w:top w:w="2" w:type="dxa"/>
           <w:left w:w="105" w:type="dxa"/>
-          <w:bottom w:w="0" w:type="dxa"/>
           <w:right w:w="59" w:type="dxa"/>
         </w:tblCellMar>
         <w:tblLook w:val="04A0" w:firstRow="1" w:lastRow="0" w:firstColumn="1" w:lastColumn="0" w:noHBand="0" w:noVBand="1"/>
@@ -229,21 +220,12 @@
               <w:spacing w:after="0" w:line="259" w:lineRule="auto"/>
               <w:ind w:left="0" w:firstLine="0"/>
             </w:pPr>
-            <w:proofErr w:type="spellStart"/>
-            <w:r>
-              <w:rPr>
-                <w:b/>
-                <w:color w:val="124F1A"/>
-              </w:rPr>
-              <w:t>React</w:t>
-            </w:r>
-            <w:proofErr w:type="spellEnd"/>
-            <w:r>
-              <w:rPr>
-                <w:b/>
-                <w:color w:val="124F1A"/>
-              </w:rPr>
-              <w:t xml:space="preserve"> </w:t>
+            <w:r>
+              <w:rPr>
+                <w:b/>
+                <w:color w:val="124F1A"/>
+              </w:rPr>
+              <w:t xml:space="preserve">React </w:t>
             </w:r>
           </w:p>
         </w:tc>
@@ -315,21 +297,7 @@
               <w:rPr>
                 <w:color w:val="124F1A"/>
               </w:rPr>
-              <w:t xml:space="preserve">Instalación y configuración inicial de </w:t>
-            </w:r>
-            <w:proofErr w:type="spellStart"/>
-            <w:r>
-              <w:rPr>
-                <w:color w:val="124F1A"/>
-              </w:rPr>
-              <w:t>React</w:t>
-            </w:r>
-            <w:proofErr w:type="spellEnd"/>
-            <w:r>
-              <w:rPr>
-                <w:color w:val="124F1A"/>
-              </w:rPr>
-              <w:t xml:space="preserve"> con JavaScript. </w:t>
+              <w:t xml:space="preserve">Instalación y configuración inicial de React con JavaScript. </w:t>
             </w:r>
           </w:p>
         </w:tc>
@@ -353,21 +321,7 @@
               <w:rPr>
                 <w:color w:val="124F1A"/>
               </w:rPr>
-              <w:t xml:space="preserve">Verificación de que </w:t>
-            </w:r>
-            <w:proofErr w:type="spellStart"/>
-            <w:r>
-              <w:rPr>
-                <w:color w:val="124F1A"/>
-              </w:rPr>
-              <w:t>React</w:t>
-            </w:r>
-            <w:proofErr w:type="spellEnd"/>
-            <w:r>
-              <w:rPr>
-                <w:color w:val="124F1A"/>
-              </w:rPr>
-              <w:t xml:space="preserve"> se ejecute correctamente en el entorno local. </w:t>
+              <w:t>Abrir React en el navegador y comprobar que muestra algo en pantalla.</w:t>
             </w:r>
           </w:p>
         </w:tc>
@@ -515,7 +469,7 @@
               <w:rPr>
                 <w:color w:val="124F1A"/>
               </w:rPr>
-              <w:t xml:space="preserve">Verificación de que Django funcione correctamente con el servidor local. </w:t>
+              <w:t>Ejecutar Django y comprobar que se abre en el navegador sin errores.</w:t>
             </w:r>
           </w:p>
         </w:tc>
@@ -665,6 +619,361 @@
         <w:spacing w:after="184" w:line="259" w:lineRule="auto"/>
         <w:ind w:left="0" w:firstLine="0"/>
       </w:pPr>
+    </w:p>
+    <w:p>
+      <w:pPr>
+        <w:spacing w:after="184" w:line="259" w:lineRule="auto"/>
+        <w:ind w:left="0" w:firstLine="0"/>
+        <w:rPr>
+          <w:b/>
+          <w:bCs/>
+        </w:rPr>
+      </w:pPr>
+      <w:r>
+        <w:rPr>
+          <w:b/>
+          <w:bCs/>
+        </w:rPr>
+        <w:t xml:space="preserve">Sprint 2: Creación de interfaces en </w:t>
+      </w:r>
+      <w:proofErr w:type="spellStart"/>
+      <w:r>
+        <w:rPr>
+          <w:b/>
+          <w:bCs/>
+        </w:rPr>
+        <w:t>Figma</w:t>
+      </w:r>
+      <w:proofErr w:type="spellEnd"/>
+    </w:p>
+    <w:tbl>
+      <w:tblPr>
+        <w:tblStyle w:val="Tablaconcuadrcula6concolores-nfasis3"/>
+        <w:tblW w:w="0" w:type="auto"/>
+        <w:tblLook w:val="04A0" w:firstRow="1" w:lastRow="0" w:firstColumn="1" w:lastColumn="0" w:noHBand="0" w:noVBand="1"/>
+      </w:tblPr>
+      <w:tblGrid>
+        <w:gridCol w:w="1975"/>
+        <w:gridCol w:w="1200"/>
+        <w:gridCol w:w="1138"/>
+        <w:gridCol w:w="2014"/>
+        <w:gridCol w:w="2156"/>
+      </w:tblGrid>
+      <w:tr>
+        <w:trPr>
+          <w:cnfStyle w:val="100000000000" w:firstRow="1" w:lastRow="0" w:firstColumn="0" w:lastColumn="0" w:oddVBand="0" w:evenVBand="0" w:oddHBand="0" w:evenHBand="0" w:firstRowFirstColumn="0" w:firstRowLastColumn="0" w:lastRowFirstColumn="0" w:lastRowLastColumn="0"/>
+        </w:trPr>
+        <w:tc>
+          <w:tcPr>
+            <w:cnfStyle w:val="001000000000" w:firstRow="0" w:lastRow="0" w:firstColumn="1" w:lastColumn="0" w:oddVBand="0" w:evenVBand="0" w:oddHBand="0" w:evenHBand="0" w:firstRowFirstColumn="0" w:firstRowLastColumn="0" w:lastRowFirstColumn="0" w:lastRowLastColumn="0"/>
+            <w:tcW w:w="0" w:type="auto"/>
+            <w:hideMark/>
+          </w:tcPr>
+          <w:p>
+            <w:pPr>
+              <w:spacing w:after="184" w:line="259" w:lineRule="auto"/>
+              <w:ind w:left="0" w:firstLine="0"/>
+            </w:pPr>
+            <w:r>
+              <w:t>Tarea</w:t>
+            </w:r>
+          </w:p>
+        </w:tc>
+        <w:tc>
+          <w:tcPr>
+            <w:tcW w:w="0" w:type="auto"/>
+            <w:hideMark/>
+          </w:tcPr>
+          <w:p>
+            <w:pPr>
+              <w:spacing w:after="184" w:line="259" w:lineRule="auto"/>
+              <w:ind w:left="0" w:firstLine="0"/>
+              <w:cnfStyle w:val="100000000000" w:firstRow="1" w:lastRow="0" w:firstColumn="0" w:lastColumn="0" w:oddVBand="0" w:evenVBand="0" w:oddHBand="0" w:evenHBand="0" w:firstRowFirstColumn="0" w:firstRowLastColumn="0" w:lastRowFirstColumn="0" w:lastRowLastColumn="0"/>
+            </w:pPr>
+            <w:r>
+              <w:t>Duración (horas)</w:t>
+            </w:r>
+          </w:p>
+        </w:tc>
+        <w:tc>
+          <w:tcPr>
+            <w:tcW w:w="0" w:type="auto"/>
+            <w:hideMark/>
+          </w:tcPr>
+          <w:p>
+            <w:pPr>
+              <w:spacing w:after="184" w:line="259" w:lineRule="auto"/>
+              <w:ind w:left="0" w:firstLine="0"/>
+              <w:cnfStyle w:val="100000000000" w:firstRow="1" w:lastRow="0" w:firstColumn="0" w:lastColumn="0" w:oddVBand="0" w:evenVBand="0" w:oddHBand="0" w:evenHBand="0" w:firstRowFirstColumn="0" w:firstRowLastColumn="0" w:lastRowFirstColumn="0" w:lastRowLastColumn="0"/>
+            </w:pPr>
+            <w:r>
+              <w:t>Prioridad</w:t>
+            </w:r>
+          </w:p>
+        </w:tc>
+        <w:tc>
+          <w:tcPr>
+            <w:tcW w:w="0" w:type="auto"/>
+            <w:hideMark/>
+          </w:tcPr>
+          <w:p>
+            <w:pPr>
+              <w:spacing w:after="184" w:line="259" w:lineRule="auto"/>
+              <w:ind w:left="0" w:firstLine="0"/>
+              <w:cnfStyle w:val="100000000000" w:firstRow="1" w:lastRow="0" w:firstColumn="0" w:lastColumn="0" w:oddVBand="0" w:evenVBand="0" w:oddHBand="0" w:evenHBand="0" w:firstRowFirstColumn="0" w:firstRowLastColumn="0" w:lastRowFirstColumn="0" w:lastRowLastColumn="0"/>
+            </w:pPr>
+            <w:r>
+              <w:t>Descripción</w:t>
+            </w:r>
+          </w:p>
+        </w:tc>
+        <w:tc>
+          <w:tcPr>
+            <w:tcW w:w="0" w:type="auto"/>
+            <w:hideMark/>
+          </w:tcPr>
+          <w:p>
+            <w:pPr>
+              <w:spacing w:after="184" w:line="259" w:lineRule="auto"/>
+              <w:ind w:left="0" w:firstLine="0"/>
+              <w:cnfStyle w:val="100000000000" w:firstRow="1" w:lastRow="0" w:firstColumn="0" w:lastColumn="0" w:oddVBand="0" w:evenVBand="0" w:oddHBand="0" w:evenHBand="0" w:firstRowFirstColumn="0" w:firstRowLastColumn="0" w:lastRowFirstColumn="0" w:lastRowLastColumn="0"/>
+            </w:pPr>
+            <w:r>
+              <w:t>Validación</w:t>
+            </w:r>
+          </w:p>
+        </w:tc>
+      </w:tr>
+      <w:tr>
+        <w:trPr>
+          <w:cnfStyle w:val="000000100000" w:firstRow="0" w:lastRow="0" w:firstColumn="0" w:lastColumn="0" w:oddVBand="0" w:evenVBand="0" w:oddHBand="1" w:evenHBand="0" w:firstRowFirstColumn="0" w:firstRowLastColumn="0" w:lastRowFirstColumn="0" w:lastRowLastColumn="0"/>
+        </w:trPr>
+        <w:tc>
+          <w:tcPr>
+            <w:cnfStyle w:val="001000000000" w:firstRow="0" w:lastRow="0" w:firstColumn="1" w:lastColumn="0" w:oddVBand="0" w:evenVBand="0" w:oddHBand="0" w:evenHBand="0" w:firstRowFirstColumn="0" w:firstRowLastColumn="0" w:lastRowFirstColumn="0" w:lastRowLastColumn="0"/>
+            <w:tcW w:w="0" w:type="auto"/>
+            <w:hideMark/>
+          </w:tcPr>
+          <w:p>
+            <w:pPr>
+              <w:spacing w:after="184" w:line="259" w:lineRule="auto"/>
+              <w:ind w:left="0" w:firstLine="0"/>
+            </w:pPr>
+            <w:r>
+              <w:t xml:space="preserve">Diseño de la interfaz </w:t>
+            </w:r>
+            <w:proofErr w:type="spellStart"/>
+            <w:r>
+              <w:t>Login</w:t>
+            </w:r>
+            <w:proofErr w:type="spellEnd"/>
+          </w:p>
+        </w:tc>
+        <w:tc>
+          <w:tcPr>
+            <w:tcW w:w="0" w:type="auto"/>
+            <w:hideMark/>
+          </w:tcPr>
+          <w:p>
+            <w:pPr>
+              <w:spacing w:after="184" w:line="259" w:lineRule="auto"/>
+              <w:ind w:left="0" w:firstLine="0"/>
+              <w:cnfStyle w:val="000000100000" w:firstRow="0" w:lastRow="0" w:firstColumn="0" w:lastColumn="0" w:oddVBand="0" w:evenVBand="0" w:oddHBand="1" w:evenHBand="0" w:firstRowFirstColumn="0" w:firstRowLastColumn="0" w:lastRowFirstColumn="0" w:lastRowLastColumn="0"/>
+            </w:pPr>
+            <w:r>
+              <w:t>6</w:t>
+            </w:r>
+          </w:p>
+        </w:tc>
+        <w:tc>
+          <w:tcPr>
+            <w:tcW w:w="0" w:type="auto"/>
+            <w:hideMark/>
+          </w:tcPr>
+          <w:p>
+            <w:pPr>
+              <w:spacing w:after="184" w:line="259" w:lineRule="auto"/>
+              <w:ind w:left="0" w:firstLine="0"/>
+              <w:cnfStyle w:val="000000100000" w:firstRow="0" w:lastRow="0" w:firstColumn="0" w:lastColumn="0" w:oddVBand="0" w:evenVBand="0" w:oddHBand="1" w:evenHBand="0" w:firstRowFirstColumn="0" w:firstRowLastColumn="0" w:lastRowFirstColumn="0" w:lastRowLastColumn="0"/>
+            </w:pPr>
+            <w:r>
+              <w:t>Alta</w:t>
+            </w:r>
+          </w:p>
+        </w:tc>
+        <w:tc>
+          <w:tcPr>
+            <w:tcW w:w="0" w:type="auto"/>
+            <w:hideMark/>
+          </w:tcPr>
+          <w:p>
+            <w:pPr>
+              <w:spacing w:after="184" w:line="259" w:lineRule="auto"/>
+              <w:ind w:left="0" w:firstLine="0"/>
+              <w:cnfStyle w:val="000000100000" w:firstRow="0" w:lastRow="0" w:firstColumn="0" w:lastColumn="0" w:oddVBand="0" w:evenVBand="0" w:oddHBand="1" w:evenHBand="0" w:firstRowFirstColumn="0" w:firstRowLastColumn="0" w:lastRowFirstColumn="0" w:lastRowLastColumn="0"/>
+            </w:pPr>
+            <w:r>
+              <w:t xml:space="preserve">Creación del diseño visual de la interfaz de inicio de sesión en </w:t>
+            </w:r>
+            <w:proofErr w:type="spellStart"/>
+            <w:r>
+              <w:t>Figma</w:t>
+            </w:r>
+            <w:proofErr w:type="spellEnd"/>
+            <w:r>
+              <w:t>.</w:t>
+            </w:r>
+          </w:p>
+        </w:tc>
+        <w:tc>
+          <w:tcPr>
+            <w:tcW w:w="0" w:type="auto"/>
+            <w:hideMark/>
+          </w:tcPr>
+          <w:p>
+            <w:pPr>
+              <w:spacing w:after="184" w:line="259" w:lineRule="auto"/>
+              <w:ind w:left="0" w:firstLine="0"/>
+              <w:cnfStyle w:val="000000100000" w:firstRow="0" w:lastRow="0" w:firstColumn="0" w:lastColumn="0" w:oddVBand="0" w:evenVBand="0" w:oddHBand="1" w:evenHBand="0" w:firstRowFirstColumn="0" w:firstRowLastColumn="0" w:lastRowFirstColumn="0" w:lastRowLastColumn="0"/>
+            </w:pPr>
+            <w:r>
+              <w:t>Validación</w:t>
+            </w:r>
+            <w:r>
+              <w:t xml:space="preserve"> y aprobación</w:t>
+            </w:r>
+            <w:r>
+              <w:t xml:space="preserve"> visual</w:t>
+            </w:r>
+            <w:r>
+              <w:t xml:space="preserve"> del personal de Abastos el Ahorro</w:t>
+            </w:r>
+          </w:p>
+        </w:tc>
+      </w:tr>
+      <w:tr>
+        <w:tc>
+          <w:tcPr>
+            <w:cnfStyle w:val="001000000000" w:firstRow="0" w:lastRow="0" w:firstColumn="1" w:lastColumn="0" w:oddVBand="0" w:evenVBand="0" w:oddHBand="0" w:evenHBand="0" w:firstRowFirstColumn="0" w:firstRowLastColumn="0" w:lastRowFirstColumn="0" w:lastRowLastColumn="0"/>
+            <w:tcW w:w="0" w:type="auto"/>
+            <w:hideMark/>
+          </w:tcPr>
+          <w:p>
+            <w:pPr>
+              <w:spacing w:after="184" w:line="259" w:lineRule="auto"/>
+              <w:ind w:left="0" w:firstLine="0"/>
+            </w:pPr>
+            <w:r>
+              <w:t>Diseño del dashboard</w:t>
+            </w:r>
+            <w:r>
+              <w:t xml:space="preserve"> y más componentes a usar</w:t>
+            </w:r>
+          </w:p>
+        </w:tc>
+        <w:tc>
+          <w:tcPr>
+            <w:tcW w:w="0" w:type="auto"/>
+            <w:hideMark/>
+          </w:tcPr>
+          <w:p>
+            <w:pPr>
+              <w:spacing w:after="184" w:line="259" w:lineRule="auto"/>
+              <w:ind w:left="0" w:firstLine="0"/>
+              <w:cnfStyle w:val="000000000000" w:firstRow="0" w:lastRow="0" w:firstColumn="0" w:lastColumn="0" w:oddVBand="0" w:evenVBand="0" w:oddHBand="0" w:evenHBand="0" w:firstRowFirstColumn="0" w:firstRowLastColumn="0" w:lastRowFirstColumn="0" w:lastRowLastColumn="0"/>
+            </w:pPr>
+            <w:r>
+              <w:t>6</w:t>
+            </w:r>
+          </w:p>
+        </w:tc>
+        <w:tc>
+          <w:tcPr>
+            <w:tcW w:w="0" w:type="auto"/>
+            <w:hideMark/>
+          </w:tcPr>
+          <w:p>
+            <w:pPr>
+              <w:spacing w:after="184" w:line="259" w:lineRule="auto"/>
+              <w:ind w:left="0" w:firstLine="0"/>
+              <w:cnfStyle w:val="000000000000" w:firstRow="0" w:lastRow="0" w:firstColumn="0" w:lastColumn="0" w:oddVBand="0" w:evenVBand="0" w:oddHBand="0" w:evenHBand="0" w:firstRowFirstColumn="0" w:firstRowLastColumn="0" w:lastRowFirstColumn="0" w:lastRowLastColumn="0"/>
+            </w:pPr>
+            <w:r>
+              <w:t>Alta</w:t>
+            </w:r>
+          </w:p>
+        </w:tc>
+        <w:tc>
+          <w:tcPr>
+            <w:tcW w:w="0" w:type="auto"/>
+            <w:hideMark/>
+          </w:tcPr>
+          <w:p>
+            <w:pPr>
+              <w:spacing w:after="184" w:line="259" w:lineRule="auto"/>
+              <w:ind w:left="0" w:firstLine="0"/>
+              <w:cnfStyle w:val="000000000000" w:firstRow="0" w:lastRow="0" w:firstColumn="0" w:lastColumn="0" w:oddVBand="0" w:evenVBand="0" w:oddHBand="0" w:evenHBand="0" w:firstRowFirstColumn="0" w:firstRowLastColumn="0" w:lastRowFirstColumn="0" w:lastRowLastColumn="0"/>
+            </w:pPr>
+            <w:r>
+              <w:t>Diseño de</w:t>
+            </w:r>
+            <w:r>
+              <w:t xml:space="preserve"> </w:t>
+            </w:r>
+            <w:r>
+              <w:t>interfa</w:t>
+            </w:r>
+            <w:r>
+              <w:t xml:space="preserve">ces </w:t>
+            </w:r>
+            <w:r>
+              <w:t>principal</w:t>
+            </w:r>
+            <w:r>
+              <w:t>es</w:t>
+            </w:r>
+            <w:r>
+              <w:t xml:space="preserve"> para usuarios en </w:t>
+            </w:r>
+            <w:proofErr w:type="spellStart"/>
+            <w:r>
+              <w:t>Figma</w:t>
+            </w:r>
+            <w:proofErr w:type="spellEnd"/>
+            <w:r>
+              <w:t>.</w:t>
+            </w:r>
+          </w:p>
+        </w:tc>
+        <w:tc>
+          <w:tcPr>
+            <w:tcW w:w="0" w:type="auto"/>
+            <w:hideMark/>
+          </w:tcPr>
+          <w:p>
+            <w:pPr>
+              <w:spacing w:after="184" w:line="259" w:lineRule="auto"/>
+              <w:ind w:left="0" w:firstLine="0"/>
+              <w:cnfStyle w:val="000000000000" w:firstRow="0" w:lastRow="0" w:firstColumn="0" w:lastColumn="0" w:oddVBand="0" w:evenVBand="0" w:oddHBand="0" w:evenHBand="0" w:firstRowFirstColumn="0" w:firstRowLastColumn="0" w:lastRowFirstColumn="0" w:lastRowLastColumn="0"/>
+            </w:pPr>
+            <w:r>
+              <w:t xml:space="preserve">Comprobar que los botones y las secciones </w:t>
+            </w:r>
+            <w:r>
+              <w:t>estén bien ubicados y puedan visualizar</w:t>
+            </w:r>
+            <w:r>
+              <w:t xml:space="preserve">se </w:t>
+            </w:r>
+          </w:p>
+        </w:tc>
+      </w:tr>
+    </w:tbl>
+    <w:p>
+      <w:pPr>
+        <w:spacing w:after="184" w:line="259" w:lineRule="auto"/>
+        <w:ind w:left="0" w:firstLine="0"/>
+      </w:pPr>
       <w:r>
         <w:t xml:space="preserve"> </w:t>
       </w:r>
@@ -678,6 +987,7 @@
         <w:rPr>
           <w:b/>
         </w:rPr>
+        <w:lastRenderedPageBreak/>
         <w:t xml:space="preserve">Sprint 2: Desarrollo de la interfaz de </w:t>
       </w:r>
       <w:proofErr w:type="spellStart"/>
@@ -703,7 +1013,6 @@
         <w:tblCellMar>
           <w:top w:w="4" w:type="dxa"/>
           <w:left w:w="105" w:type="dxa"/>
-          <w:bottom w:w="0" w:type="dxa"/>
           <w:right w:w="61" w:type="dxa"/>
         </w:tblCellMar>
         <w:tblLook w:val="04A0" w:firstRow="1" w:lastRow="0" w:firstColumn="1" w:lastColumn="0" w:noHBand="0" w:noVBand="1"/>
@@ -889,188 +1198,178 @@
                 <w:b/>
                 <w:color w:val="124F1A"/>
               </w:rPr>
-              <w:t xml:space="preserve"> en </w:t>
+              <w:t xml:space="preserve"> en React </w:t>
+            </w:r>
+          </w:p>
+        </w:tc>
+        <w:tc>
+          <w:tcPr>
+            <w:tcW w:w="1237" w:type="dxa"/>
+            <w:tcBorders>
+              <w:top w:val="single" w:sz="11" w:space="0" w:color="47D459"/>
+              <w:left w:val="single" w:sz="3" w:space="0" w:color="47D459"/>
+              <w:bottom w:val="single" w:sz="3" w:space="0" w:color="47D459"/>
+              <w:right w:val="single" w:sz="3" w:space="0" w:color="47D459"/>
+            </w:tcBorders>
+            <w:shd w:val="clear" w:color="auto" w:fill="C1F0C7"/>
+          </w:tcPr>
+          <w:p>
+            <w:pPr>
+              <w:spacing w:after="0" w:line="259" w:lineRule="auto"/>
+              <w:ind w:left="3" w:firstLine="0"/>
+            </w:pPr>
+            <w:r>
+              <w:rPr>
+                <w:color w:val="124F1A"/>
+              </w:rPr>
+              <w:t xml:space="preserve">8 </w:t>
+            </w:r>
+          </w:p>
+        </w:tc>
+        <w:tc>
+          <w:tcPr>
+            <w:tcW w:w="1219" w:type="dxa"/>
+            <w:tcBorders>
+              <w:top w:val="single" w:sz="11" w:space="0" w:color="47D459"/>
+              <w:left w:val="single" w:sz="3" w:space="0" w:color="47D459"/>
+              <w:bottom w:val="single" w:sz="3" w:space="0" w:color="47D459"/>
+              <w:right w:val="single" w:sz="3" w:space="0" w:color="47D459"/>
+            </w:tcBorders>
+            <w:shd w:val="clear" w:color="auto" w:fill="C1F0C7"/>
+          </w:tcPr>
+          <w:p>
+            <w:pPr>
+              <w:spacing w:after="0" w:line="259" w:lineRule="auto"/>
+              <w:ind w:left="3" w:firstLine="0"/>
+            </w:pPr>
+            <w:r>
+              <w:rPr>
+                <w:color w:val="124F1A"/>
+              </w:rPr>
+              <w:t xml:space="preserve">Alta </w:t>
+            </w:r>
+          </w:p>
+        </w:tc>
+        <w:tc>
+          <w:tcPr>
+            <w:tcW w:w="1884" w:type="dxa"/>
+            <w:tcBorders>
+              <w:top w:val="single" w:sz="2" w:space="0" w:color="C1F0C7"/>
+              <w:left w:val="single" w:sz="3" w:space="0" w:color="47D459"/>
+              <w:bottom w:val="single" w:sz="3" w:space="0" w:color="47D459"/>
+              <w:right w:val="single" w:sz="3" w:space="0" w:color="47D459"/>
+            </w:tcBorders>
+            <w:shd w:val="clear" w:color="auto" w:fill="C1F0C7"/>
+          </w:tcPr>
+          <w:p>
+            <w:pPr>
+              <w:spacing w:after="0" w:line="259" w:lineRule="auto"/>
+              <w:ind w:left="1" w:firstLine="0"/>
+            </w:pPr>
+            <w:r>
+              <w:rPr>
+                <w:color w:val="124F1A"/>
+              </w:rPr>
+              <w:t xml:space="preserve">Creación de la interfaz de inicio de sesión en el </w:t>
             </w:r>
             <w:proofErr w:type="spellStart"/>
             <w:r>
               <w:rPr>
-                <w:b/>
-                <w:color w:val="124F1A"/>
-              </w:rPr>
-              <w:t>React</w:t>
+                <w:color w:val="124F1A"/>
+              </w:rPr>
+              <w:t>frontend</w:t>
             </w:r>
             <w:proofErr w:type="spellEnd"/>
             <w:r>
               <w:rPr>
-                <w:b/>
+                <w:color w:val="124F1A"/>
+              </w:rPr>
+              <w:t xml:space="preserve"> usando React.</w:t>
+            </w:r>
+          </w:p>
+        </w:tc>
+        <w:tc>
+          <w:tcPr>
+            <w:tcW w:w="2054" w:type="dxa"/>
+            <w:tcBorders>
+              <w:top w:val="single" w:sz="2" w:space="0" w:color="C1F0C7"/>
+              <w:left w:val="single" w:sz="3" w:space="0" w:color="47D459"/>
+              <w:bottom w:val="single" w:sz="3" w:space="0" w:color="47D459"/>
+              <w:right w:val="single" w:sz="3" w:space="0" w:color="47D459"/>
+            </w:tcBorders>
+            <w:shd w:val="clear" w:color="auto" w:fill="C1F0C7"/>
+          </w:tcPr>
+          <w:p>
+            <w:pPr>
+              <w:spacing w:after="0" w:line="259" w:lineRule="auto"/>
+              <w:ind w:left="1" w:firstLine="0"/>
+              <w:rPr>
+                <w:color w:val="124F1A"/>
+              </w:rPr>
+            </w:pPr>
+            <w:r>
+              <w:rPr>
+                <w:color w:val="124F1A"/>
+              </w:rPr>
+              <w:t xml:space="preserve">Verificación de que los usuarios puedan </w:t>
+            </w:r>
+            <w:r>
+              <w:rPr>
+                <w:color w:val="124F1A"/>
+              </w:rPr>
+              <w:t xml:space="preserve">visualizar la </w:t>
+            </w:r>
+            <w:proofErr w:type="spellStart"/>
+            <w:r>
+              <w:rPr>
+                <w:color w:val="124F1A"/>
+              </w:rPr>
+              <w:t>intefaz</w:t>
+            </w:r>
+            <w:proofErr w:type="spellEnd"/>
+            <w:r>
+              <w:rPr>
                 <w:color w:val="124F1A"/>
               </w:rPr>
               <w:t xml:space="preserve"> </w:t>
             </w:r>
-          </w:p>
-        </w:tc>
-        <w:tc>
-          <w:tcPr>
-            <w:tcW w:w="1237" w:type="dxa"/>
-            <w:tcBorders>
-              <w:top w:val="single" w:sz="11" w:space="0" w:color="47D459"/>
-              <w:left w:val="single" w:sz="3" w:space="0" w:color="47D459"/>
-              <w:bottom w:val="single" w:sz="3" w:space="0" w:color="47D459"/>
-              <w:right w:val="single" w:sz="3" w:space="0" w:color="47D459"/>
-            </w:tcBorders>
-            <w:shd w:val="clear" w:color="auto" w:fill="C1F0C7"/>
-          </w:tcPr>
-          <w:p>
-            <w:pPr>
-              <w:spacing w:after="0" w:line="259" w:lineRule="auto"/>
-              <w:ind w:left="3" w:firstLine="0"/>
-            </w:pPr>
-            <w:r>
-              <w:rPr>
-                <w:color w:val="124F1A"/>
-              </w:rPr>
-              <w:t xml:space="preserve">8 </w:t>
-            </w:r>
-          </w:p>
-        </w:tc>
-        <w:tc>
-          <w:tcPr>
-            <w:tcW w:w="1219" w:type="dxa"/>
-            <w:tcBorders>
-              <w:top w:val="single" w:sz="11" w:space="0" w:color="47D459"/>
-              <w:left w:val="single" w:sz="3" w:space="0" w:color="47D459"/>
-              <w:bottom w:val="single" w:sz="3" w:space="0" w:color="47D459"/>
-              <w:right w:val="single" w:sz="3" w:space="0" w:color="47D459"/>
-            </w:tcBorders>
-            <w:shd w:val="clear" w:color="auto" w:fill="C1F0C7"/>
-          </w:tcPr>
-          <w:p>
-            <w:pPr>
-              <w:spacing w:after="0" w:line="259" w:lineRule="auto"/>
-              <w:ind w:left="3" w:firstLine="0"/>
-            </w:pPr>
-            <w:r>
-              <w:rPr>
-                <w:color w:val="124F1A"/>
-              </w:rPr>
-              <w:t xml:space="preserve">Alta </w:t>
-            </w:r>
-          </w:p>
-        </w:tc>
-        <w:tc>
-          <w:tcPr>
-            <w:tcW w:w="1884" w:type="dxa"/>
-            <w:tcBorders>
-              <w:top w:val="single" w:sz="2" w:space="0" w:color="C1F0C7"/>
-              <w:left w:val="single" w:sz="3" w:space="0" w:color="47D459"/>
-              <w:bottom w:val="single" w:sz="3" w:space="0" w:color="47D459"/>
-              <w:right w:val="single" w:sz="3" w:space="0" w:color="47D459"/>
-            </w:tcBorders>
-            <w:shd w:val="clear" w:color="auto" w:fill="C1F0C7"/>
-          </w:tcPr>
+            <w:proofErr w:type="spellStart"/>
+            <w:r>
+              <w:rPr>
+                <w:color w:val="124F1A"/>
+              </w:rPr>
+              <w:t>login</w:t>
+            </w:r>
+            <w:proofErr w:type="spellEnd"/>
+          </w:p>
           <w:p>
             <w:pPr>
               <w:spacing w:after="0" w:line="259" w:lineRule="auto"/>
               <w:ind w:left="1" w:firstLine="0"/>
-            </w:pPr>
-            <w:r>
-              <w:rPr>
-                <w:color w:val="124F1A"/>
-              </w:rPr>
-              <w:t>Creación de</w:t>
-            </w:r>
-            <w:r>
-              <w:rPr>
-                <w:color w:val="124F1A"/>
-              </w:rPr>
-              <w:t xml:space="preserve"> la interfaz </w:t>
-            </w:r>
-            <w:r>
-              <w:rPr>
-                <w:color w:val="124F1A"/>
-              </w:rPr>
-              <w:t xml:space="preserve">en el </w:t>
+              <w:rPr>
+                <w:color w:val="124F1A"/>
+              </w:rPr>
+            </w:pPr>
+            <w:r>
+              <w:rPr>
+                <w:color w:val="124F1A"/>
+              </w:rPr>
+              <w:t xml:space="preserve">Abrir la página del </w:t>
             </w:r>
             <w:proofErr w:type="spellStart"/>
             <w:r>
               <w:rPr>
                 <w:color w:val="124F1A"/>
               </w:rPr>
-              <w:t>frontend</w:t>
+              <w:t>login</w:t>
             </w:r>
             <w:proofErr w:type="spellEnd"/>
             <w:r>
               <w:rPr>
                 <w:color w:val="124F1A"/>
               </w:rPr>
-              <w:t xml:space="preserve"> usando </w:t>
-            </w:r>
-            <w:proofErr w:type="spellStart"/>
-            <w:r>
-              <w:rPr>
-                <w:color w:val="124F1A"/>
-              </w:rPr>
-              <w:t>React</w:t>
-            </w:r>
-            <w:proofErr w:type="spellEnd"/>
-            <w:r>
-              <w:rPr>
-                <w:color w:val="124F1A"/>
-              </w:rPr>
-              <w:t xml:space="preserve">. </w:t>
-            </w:r>
-          </w:p>
-        </w:tc>
-        <w:tc>
-          <w:tcPr>
-            <w:tcW w:w="2054" w:type="dxa"/>
-            <w:tcBorders>
-              <w:top w:val="single" w:sz="2" w:space="0" w:color="C1F0C7"/>
-              <w:left w:val="single" w:sz="3" w:space="0" w:color="47D459"/>
-              <w:bottom w:val="single" w:sz="3" w:space="0" w:color="47D459"/>
-              <w:right w:val="single" w:sz="3" w:space="0" w:color="47D459"/>
-            </w:tcBorders>
-            <w:shd w:val="clear" w:color="auto" w:fill="C1F0C7"/>
-          </w:tcPr>
-          <w:p>
-            <w:pPr>
-              <w:spacing w:after="0" w:line="259" w:lineRule="auto"/>
-              <w:ind w:left="1" w:firstLine="0"/>
-            </w:pPr>
-            <w:r>
-              <w:rPr>
-                <w:color w:val="124F1A"/>
-              </w:rPr>
-              <w:t xml:space="preserve">Verificación de que los usuarios puedan </w:t>
-            </w:r>
-            <w:r>
-              <w:rPr>
-                <w:color w:val="124F1A"/>
-              </w:rPr>
-              <w:t xml:space="preserve">visualizar la </w:t>
-            </w:r>
-            <w:proofErr w:type="spellStart"/>
-            <w:r>
-              <w:rPr>
-                <w:color w:val="124F1A"/>
-              </w:rPr>
-              <w:t>intefaz</w:t>
-            </w:r>
-            <w:proofErr w:type="spellEnd"/>
-            <w:r>
-              <w:rPr>
-                <w:color w:val="124F1A"/>
-              </w:rPr>
-              <w:t xml:space="preserve"> </w:t>
-            </w:r>
-            <w:proofErr w:type="spellStart"/>
-            <w:r>
-              <w:rPr>
-                <w:color w:val="124F1A"/>
-              </w:rPr>
-              <w:t>login</w:t>
-            </w:r>
-            <w:proofErr w:type="spellEnd"/>
+              <w:t xml:space="preserve"> y comprobar que el formulario aparece.</w:t>
+            </w:r>
           </w:p>
         </w:tc>
       </w:tr>
@@ -1099,7 +1398,6 @@
                 <w:b/>
                 <w:color w:val="124F1A"/>
               </w:rPr>
-              <w:lastRenderedPageBreak/>
               <w:t xml:space="preserve">Conexión </w:t>
             </w:r>
             <w:proofErr w:type="spellStart"/>
@@ -1204,21 +1502,7 @@
               <w:rPr>
                 <w:color w:val="124F1A"/>
               </w:rPr>
-              <w:t xml:space="preserve">Integración de </w:t>
-            </w:r>
-            <w:proofErr w:type="spellStart"/>
-            <w:r>
-              <w:rPr>
-                <w:color w:val="124F1A"/>
-              </w:rPr>
-              <w:t>React</w:t>
-            </w:r>
-            <w:proofErr w:type="spellEnd"/>
-            <w:r>
-              <w:rPr>
-                <w:color w:val="124F1A"/>
-              </w:rPr>
-              <w:t xml:space="preserve"> con Django para el manejo de la autenticación. </w:t>
+              <w:t xml:space="preserve">Integración de React con Django para el manejo de la autenticación. </w:t>
             </w:r>
           </w:p>
         </w:tc>
@@ -1242,61 +1526,7 @@
               <w:rPr>
                 <w:color w:val="124F1A"/>
               </w:rPr>
-              <w:t xml:space="preserve">Validación de que </w:t>
-            </w:r>
-            <w:r>
-              <w:rPr>
-                <w:color w:val="124F1A"/>
-              </w:rPr>
-              <w:t>el</w:t>
-            </w:r>
-            <w:r>
-              <w:rPr>
-                <w:color w:val="124F1A"/>
-              </w:rPr>
-              <w:t xml:space="preserve"> </w:t>
-            </w:r>
-            <w:proofErr w:type="spellStart"/>
-            <w:r>
-              <w:rPr>
-                <w:color w:val="124F1A"/>
-              </w:rPr>
-              <w:t>login</w:t>
-            </w:r>
-            <w:proofErr w:type="spellEnd"/>
-            <w:r>
-              <w:rPr>
-                <w:color w:val="124F1A"/>
-              </w:rPr>
-              <w:t xml:space="preserve"> desde </w:t>
-            </w:r>
-            <w:proofErr w:type="spellStart"/>
-            <w:r>
-              <w:rPr>
-                <w:color w:val="124F1A"/>
-              </w:rPr>
-              <w:t>React</w:t>
-            </w:r>
-            <w:proofErr w:type="spellEnd"/>
-            <w:r>
-              <w:rPr>
-                <w:color w:val="124F1A"/>
-              </w:rPr>
-              <w:t xml:space="preserve"> funcionan correctamente con el </w:t>
-            </w:r>
-            <w:proofErr w:type="spellStart"/>
-            <w:r>
-              <w:rPr>
-                <w:color w:val="124F1A"/>
-              </w:rPr>
-              <w:t>backend</w:t>
-            </w:r>
-            <w:proofErr w:type="spellEnd"/>
-            <w:r>
-              <w:rPr>
-                <w:color w:val="124F1A"/>
-              </w:rPr>
-              <w:t xml:space="preserve">. </w:t>
+              <w:t>Probar con un usuario y una contraseña para ver si funciona el inicio de sesión.</w:t>
             </w:r>
           </w:p>
         </w:tc>
@@ -1329,9 +1559,7 @@
         <w:tblW w:w="8495" w:type="dxa"/>
         <w:tblInd w:w="7" w:type="dxa"/>
         <w:tblCellMar>
-          <w:top w:w="0" w:type="dxa"/>
           <w:left w:w="105" w:type="dxa"/>
-          <w:bottom w:w="0" w:type="dxa"/>
           <w:right w:w="61" w:type="dxa"/>
         </w:tblCellMar>
         <w:tblLook w:val="04A0" w:firstRow="1" w:lastRow="0" w:firstColumn="1" w:lastColumn="0" w:noHBand="0" w:noVBand="1"/>
@@ -1501,21 +1729,12 @@
               <w:spacing w:after="0" w:line="259" w:lineRule="auto"/>
               <w:ind w:left="0" w:firstLine="0"/>
             </w:pPr>
-            <w:proofErr w:type="spellStart"/>
-            <w:r>
-              <w:rPr>
-                <w:b/>
-                <w:color w:val="124F1A"/>
-              </w:rPr>
-              <w:t>React</w:t>
-            </w:r>
-            <w:proofErr w:type="spellEnd"/>
-            <w:r>
-              <w:rPr>
-                <w:b/>
-                <w:color w:val="124F1A"/>
-              </w:rPr>
-              <w:t xml:space="preserve"> </w:t>
+            <w:r>
+              <w:rPr>
+                <w:b/>
+                <w:color w:val="124F1A"/>
+              </w:rPr>
+              <w:t xml:space="preserve">React </w:t>
             </w:r>
           </w:p>
         </w:tc>
@@ -1587,21 +1806,7 @@
               <w:rPr>
                 <w:color w:val="124F1A"/>
               </w:rPr>
-              <w:t xml:space="preserve">Creación de formulario en </w:t>
-            </w:r>
-            <w:proofErr w:type="spellStart"/>
-            <w:r>
-              <w:rPr>
-                <w:color w:val="124F1A"/>
-              </w:rPr>
-              <w:t>React</w:t>
-            </w:r>
-            <w:proofErr w:type="spellEnd"/>
-            <w:r>
-              <w:rPr>
-                <w:color w:val="124F1A"/>
-              </w:rPr>
-              <w:t xml:space="preserve"> para agregar, editar y eliminar productos. </w:t>
+              <w:t xml:space="preserve">Creación de formulario en React para agregar, editar y eliminar productos. </w:t>
             </w:r>
           </w:p>
         </w:tc>
@@ -1845,6 +2050,7 @@
                 <w:b/>
                 <w:color w:val="124F1A"/>
               </w:rPr>
+              <w:lastRenderedPageBreak/>
               <w:t xml:space="preserve">Conexión </w:t>
             </w:r>
             <w:proofErr w:type="spellStart"/>
@@ -1957,19 +2163,11 @@
               <w:spacing w:after="0" w:line="279" w:lineRule="auto"/>
               <w:ind w:left="1" w:right="41" w:firstLine="0"/>
             </w:pPr>
-            <w:proofErr w:type="spellStart"/>
-            <w:r>
-              <w:rPr>
-                <w:color w:val="124F1A"/>
-              </w:rPr>
-              <w:t>React</w:t>
-            </w:r>
-            <w:proofErr w:type="spellEnd"/>
-            <w:r>
-              <w:rPr>
-                <w:color w:val="124F1A"/>
-              </w:rPr>
-              <w:t xml:space="preserve"> con Django para las </w:t>
+            <w:r>
+              <w:rPr>
+                <w:color w:val="124F1A"/>
+              </w:rPr>
+              <w:t xml:space="preserve">React con Django para las </w:t>
             </w:r>
           </w:p>
           <w:p>
@@ -2080,7 +2278,6 @@
         <w:tblCellMar>
           <w:top w:w="4" w:type="dxa"/>
           <w:left w:w="105" w:type="dxa"/>
-          <w:bottom w:w="0" w:type="dxa"/>
           <w:right w:w="63" w:type="dxa"/>
         </w:tblCellMar>
         <w:tblLook w:val="04A0" w:firstRow="1" w:lastRow="0" w:firstColumn="1" w:lastColumn="0" w:noHBand="0" w:noVBand="1"/>
@@ -2116,7 +2313,6 @@
                 <w:b/>
                 <w:color w:val="124F1A"/>
               </w:rPr>
-              <w:lastRenderedPageBreak/>
               <w:t xml:space="preserve">Tarea </w:t>
             </w:r>
           </w:p>
@@ -2244,23 +2440,7 @@
                 <w:b/>
                 <w:color w:val="124F1A"/>
               </w:rPr>
-              <w:t xml:space="preserve">Desarrollo del formulario de ventas en </w:t>
-            </w:r>
-            <w:proofErr w:type="spellStart"/>
-            <w:r>
-              <w:rPr>
-                <w:b/>
-                <w:color w:val="124F1A"/>
-              </w:rPr>
-              <w:t>React</w:t>
-            </w:r>
-            <w:proofErr w:type="spellEnd"/>
-            <w:r>
-              <w:rPr>
-                <w:b/>
-                <w:color w:val="124F1A"/>
-              </w:rPr>
-              <w:t xml:space="preserve"> </w:t>
+              <w:t xml:space="preserve">Desarrollo del formulario de ventas en React </w:t>
             </w:r>
           </w:p>
         </w:tc>
@@ -2332,21 +2512,7 @@
               <w:rPr>
                 <w:color w:val="124F1A"/>
               </w:rPr>
-              <w:t xml:space="preserve">Creación de formulario en </w:t>
-            </w:r>
-            <w:proofErr w:type="spellStart"/>
-            <w:r>
-              <w:rPr>
-                <w:color w:val="124F1A"/>
-              </w:rPr>
-              <w:t>React</w:t>
-            </w:r>
-            <w:proofErr w:type="spellEnd"/>
-            <w:r>
-              <w:rPr>
-                <w:color w:val="124F1A"/>
-              </w:rPr>
-              <w:t xml:space="preserve"> para registrar ventas. </w:t>
+              <w:t xml:space="preserve">Creación de formulario en React para registrar ventas. </w:t>
             </w:r>
           </w:p>
         </w:tc>
@@ -2667,7 +2833,6 @@
         <w:tblCellMar>
           <w:top w:w="3" w:type="dxa"/>
           <w:left w:w="105" w:type="dxa"/>
-          <w:bottom w:w="0" w:type="dxa"/>
           <w:right w:w="63" w:type="dxa"/>
         </w:tblCellMar>
         <w:tblLook w:val="04A0" w:firstRow="1" w:lastRow="0" w:firstColumn="1" w:lastColumn="0" w:noHBand="0" w:noVBand="1"/>
@@ -2830,6 +2995,7 @@
                 <w:b/>
                 <w:color w:val="124F1A"/>
               </w:rPr>
+              <w:lastRenderedPageBreak/>
               <w:t xml:space="preserve">Preparación de datos para Machine </w:t>
             </w:r>
           </w:p>
@@ -3397,7 +3563,6 @@
         <w:tblCellMar>
           <w:top w:w="4" w:type="dxa"/>
           <w:left w:w="105" w:type="dxa"/>
-          <w:bottom w:w="0" w:type="dxa"/>
           <w:right w:w="61" w:type="dxa"/>
         </w:tblCellMar>
         <w:tblLook w:val="04A0" w:firstRow="1" w:lastRow="0" w:firstColumn="1" w:lastColumn="0" w:noHBand="0" w:noVBand="1"/>
@@ -3568,21 +3733,12 @@
               <w:spacing w:after="0" w:line="259" w:lineRule="auto"/>
               <w:ind w:left="0" w:firstLine="0"/>
             </w:pPr>
-            <w:proofErr w:type="spellStart"/>
-            <w:r>
-              <w:rPr>
-                <w:b/>
-                <w:color w:val="124F1A"/>
-              </w:rPr>
-              <w:t>React</w:t>
-            </w:r>
-            <w:proofErr w:type="spellEnd"/>
-            <w:r>
-              <w:rPr>
-                <w:b/>
-                <w:color w:val="124F1A"/>
-              </w:rPr>
-              <w:t xml:space="preserve"> </w:t>
+            <w:r>
+              <w:rPr>
+                <w:b/>
+                <w:color w:val="124F1A"/>
+              </w:rPr>
+              <w:t xml:space="preserve">React </w:t>
             </w:r>
           </w:p>
         </w:tc>
@@ -3654,21 +3810,7 @@
               <w:rPr>
                 <w:color w:val="124F1A"/>
               </w:rPr>
-              <w:t xml:space="preserve">Creación de formulario para gestionar proveedores en </w:t>
-            </w:r>
-            <w:proofErr w:type="spellStart"/>
-            <w:r>
-              <w:rPr>
-                <w:color w:val="124F1A"/>
-              </w:rPr>
-              <w:t>React</w:t>
-            </w:r>
-            <w:proofErr w:type="spellEnd"/>
-            <w:r>
-              <w:rPr>
-                <w:color w:val="124F1A"/>
-              </w:rPr>
-              <w:t xml:space="preserve">. </w:t>
+              <w:t xml:space="preserve">Creación de formulario para gestionar proveedores en React. </w:t>
             </w:r>
           </w:p>
         </w:tc>
@@ -3899,6 +4041,7 @@
                 <w:b/>
                 <w:color w:val="124F1A"/>
               </w:rPr>
+              <w:lastRenderedPageBreak/>
               <w:t xml:space="preserve">Conexión </w:t>
             </w:r>
             <w:proofErr w:type="spellStart"/>
@@ -4011,19 +4154,11 @@
               <w:spacing w:after="3" w:line="277" w:lineRule="auto"/>
               <w:ind w:left="1" w:right="17" w:firstLine="0"/>
             </w:pPr>
-            <w:proofErr w:type="spellStart"/>
-            <w:r>
-              <w:rPr>
-                <w:color w:val="124F1A"/>
-              </w:rPr>
-              <w:t>React</w:t>
-            </w:r>
-            <w:proofErr w:type="spellEnd"/>
-            <w:r>
-              <w:rPr>
-                <w:color w:val="124F1A"/>
-              </w:rPr>
-              <w:t xml:space="preserve"> con Django para las </w:t>
+            <w:r>
+              <w:rPr>
+                <w:color w:val="124F1A"/>
+              </w:rPr>
+              <w:t xml:space="preserve">React con Django para las </w:t>
             </w:r>
           </w:p>
           <w:p>
@@ -4135,7 +4270,6 @@
         <w:rPr>
           <w:b/>
         </w:rPr>
-        <w:lastRenderedPageBreak/>
         <w:t xml:space="preserve">Sprint 7: Implementación de gestión de caja (Ingreso y salida de dinero) </w:t>
       </w:r>
     </w:p>
@@ -4147,7 +4281,6 @@
         <w:tblCellMar>
           <w:top w:w="4" w:type="dxa"/>
           <w:left w:w="105" w:type="dxa"/>
-          <w:bottom w:w="0" w:type="dxa"/>
           <w:right w:w="63" w:type="dxa"/>
         </w:tblCellMar>
         <w:tblLook w:val="04A0" w:firstRow="1" w:lastRow="0" w:firstColumn="1" w:lastColumn="0" w:noHBand="0" w:noVBand="1"/>
@@ -4310,23 +4443,7 @@
                 <w:b/>
                 <w:color w:val="124F1A"/>
               </w:rPr>
-              <w:t xml:space="preserve">Desarrollo del formulario de caja en </w:t>
-            </w:r>
-            <w:proofErr w:type="spellStart"/>
-            <w:r>
-              <w:rPr>
-                <w:b/>
-                <w:color w:val="124F1A"/>
-              </w:rPr>
-              <w:t>React</w:t>
-            </w:r>
-            <w:proofErr w:type="spellEnd"/>
-            <w:r>
-              <w:rPr>
-                <w:b/>
-                <w:color w:val="124F1A"/>
-              </w:rPr>
-              <w:t xml:space="preserve"> </w:t>
+              <w:t xml:space="preserve">Desarrollo del formulario de caja en React </w:t>
             </w:r>
           </w:p>
         </w:tc>
@@ -4398,21 +4515,7 @@
               <w:rPr>
                 <w:color w:val="124F1A"/>
               </w:rPr>
-              <w:t xml:space="preserve">Creación de formulario en </w:t>
-            </w:r>
-            <w:proofErr w:type="spellStart"/>
-            <w:r>
-              <w:rPr>
-                <w:color w:val="124F1A"/>
-              </w:rPr>
-              <w:t>React</w:t>
-            </w:r>
-            <w:proofErr w:type="spellEnd"/>
-            <w:r>
-              <w:rPr>
-                <w:color w:val="124F1A"/>
-              </w:rPr>
-              <w:t xml:space="preserve"> para registrar ingresos y egresos de dinero. </w:t>
+              <w:t xml:space="preserve">Creación de formulario en React para registrar ingresos y egresos de dinero. </w:t>
             </w:r>
           </w:p>
         </w:tc>
@@ -4701,19 +4804,11 @@
               <w:ind w:left="3" w:right="494" w:firstLine="0"/>
               <w:jc w:val="both"/>
             </w:pPr>
-            <w:proofErr w:type="spellStart"/>
-            <w:r>
-              <w:rPr>
-                <w:color w:val="124F1A"/>
-              </w:rPr>
-              <w:t>React</w:t>
-            </w:r>
-            <w:proofErr w:type="spellEnd"/>
-            <w:r>
-              <w:rPr>
-                <w:color w:val="124F1A"/>
-              </w:rPr>
-              <w:t xml:space="preserve"> con Django para registrar los ingresos y egresos. </w:t>
+            <w:r>
+              <w:rPr>
+                <w:color w:val="124F1A"/>
+              </w:rPr>
+              <w:t xml:space="preserve">React con Django para registrar los ingresos y egresos. </w:t>
             </w:r>
           </w:p>
         </w:tc>
@@ -4775,6 +4870,7 @@
         <w:rPr>
           <w:b/>
         </w:rPr>
+        <w:lastRenderedPageBreak/>
         <w:t xml:space="preserve">Sprint 8: Implementación de control de transacciones </w:t>
       </w:r>
     </w:p>
@@ -4786,7 +4882,6 @@
         <w:tblCellMar>
           <w:top w:w="3" w:type="dxa"/>
           <w:left w:w="105" w:type="dxa"/>
-          <w:bottom w:w="0" w:type="dxa"/>
           <w:right w:w="59" w:type="dxa"/>
         </w:tblCellMar>
         <w:tblLook w:val="04A0" w:firstRow="1" w:lastRow="0" w:firstColumn="1" w:lastColumn="0" w:noHBand="0" w:noVBand="1"/>
@@ -4957,21 +5052,12 @@
               <w:spacing w:after="0" w:line="259" w:lineRule="auto"/>
               <w:ind w:left="0" w:firstLine="0"/>
             </w:pPr>
-            <w:proofErr w:type="spellStart"/>
-            <w:r>
-              <w:rPr>
-                <w:b/>
-                <w:color w:val="124F1A"/>
-              </w:rPr>
-              <w:t>React</w:t>
-            </w:r>
-            <w:proofErr w:type="spellEnd"/>
-            <w:r>
-              <w:rPr>
-                <w:b/>
-                <w:color w:val="124F1A"/>
-              </w:rPr>
-              <w:t xml:space="preserve"> </w:t>
+            <w:r>
+              <w:rPr>
+                <w:b/>
+                <w:color w:val="124F1A"/>
+              </w:rPr>
+              <w:t xml:space="preserve">React </w:t>
             </w:r>
           </w:p>
         </w:tc>
@@ -5233,7 +5319,6 @@
                 <w:b/>
                 <w:color w:val="124F1A"/>
               </w:rPr>
-              <w:lastRenderedPageBreak/>
               <w:t xml:space="preserve">transacciones en Django </w:t>
             </w:r>
           </w:p>
@@ -5486,9 +5571,7 @@
         <w:tblW w:w="8495" w:type="dxa"/>
         <w:tblInd w:w="7" w:type="dxa"/>
         <w:tblCellMar>
-          <w:top w:w="0" w:type="dxa"/>
           <w:left w:w="105" w:type="dxa"/>
-          <w:bottom w:w="0" w:type="dxa"/>
           <w:right w:w="59" w:type="dxa"/>
         </w:tblCellMar>
         <w:tblLook w:val="04A0" w:firstRow="1" w:lastRow="0" w:firstColumn="1" w:lastColumn="0" w:noHBand="0" w:noVBand="1"/>
@@ -5658,21 +5741,12 @@
               <w:spacing w:after="0" w:line="259" w:lineRule="auto"/>
               <w:ind w:left="0" w:firstLine="0"/>
             </w:pPr>
-            <w:proofErr w:type="spellStart"/>
-            <w:r>
-              <w:rPr>
-                <w:b/>
-                <w:color w:val="124F1A"/>
-              </w:rPr>
-              <w:t>React</w:t>
-            </w:r>
-            <w:proofErr w:type="spellEnd"/>
-            <w:r>
-              <w:rPr>
-                <w:b/>
-                <w:color w:val="124F1A"/>
-              </w:rPr>
-              <w:t xml:space="preserve"> </w:t>
+            <w:r>
+              <w:rPr>
+                <w:b/>
+                <w:color w:val="124F1A"/>
+              </w:rPr>
+              <w:t xml:space="preserve">React </w:t>
             </w:r>
           </w:p>
         </w:tc>
@@ -5811,6 +5885,7 @@
                 <w:b/>
                 <w:color w:val="124F1A"/>
               </w:rPr>
+              <w:lastRenderedPageBreak/>
               <w:t xml:space="preserve">Implementación de generación de reportes en </w:t>
             </w:r>
           </w:p>
@@ -6091,7 +6166,6 @@
         <w:tblCellMar>
           <w:top w:w="4" w:type="dxa"/>
           <w:left w:w="105" w:type="dxa"/>
-          <w:bottom w:w="0" w:type="dxa"/>
           <w:right w:w="61" w:type="dxa"/>
         </w:tblCellMar>
         <w:tblLook w:val="04A0" w:firstRow="1" w:lastRow="0" w:firstColumn="1" w:lastColumn="0" w:noHBand="0" w:noVBand="1"/>
@@ -6127,7 +6201,6 @@
                 <w:b/>
                 <w:color w:val="124F1A"/>
               </w:rPr>
-              <w:lastRenderedPageBreak/>
               <w:t xml:space="preserve">Tarea </w:t>
             </w:r>
           </w:p>
@@ -6254,23 +6327,7 @@
                 <w:b/>
                 <w:color w:val="124F1A"/>
               </w:rPr>
-              <w:t xml:space="preserve">Desarrollo del sistema para actualizar precios en </w:t>
-            </w:r>
-            <w:proofErr w:type="spellStart"/>
-            <w:r>
-              <w:rPr>
-                <w:b/>
-                <w:color w:val="124F1A"/>
-              </w:rPr>
-              <w:t>React</w:t>
-            </w:r>
-            <w:proofErr w:type="spellEnd"/>
-            <w:r>
-              <w:rPr>
-                <w:b/>
-                <w:color w:val="124F1A"/>
-              </w:rPr>
-              <w:t xml:space="preserve"> </w:t>
+              <w:t xml:space="preserve">Desarrollo del sistema para actualizar precios en React </w:t>
             </w:r>
           </w:p>
         </w:tc>
@@ -6649,21 +6706,7 @@
               <w:rPr>
                 <w:color w:val="124F1A"/>
               </w:rPr>
-              <w:t xml:space="preserve">Integrar la actualización de precios entre </w:t>
-            </w:r>
-            <w:proofErr w:type="spellStart"/>
-            <w:r>
-              <w:rPr>
-                <w:color w:val="124F1A"/>
-              </w:rPr>
-              <w:t>React</w:t>
-            </w:r>
-            <w:proofErr w:type="spellEnd"/>
-            <w:r>
-              <w:rPr>
-                <w:color w:val="124F1A"/>
-              </w:rPr>
-              <w:t xml:space="preserve"> y Django. </w:t>
+              <w:t xml:space="preserve">Integrar la actualización de precios entre React y Django. </w:t>
             </w:r>
           </w:p>
         </w:tc>
@@ -6699,6 +6742,7 @@
         <w:ind w:left="0" w:firstLine="0"/>
       </w:pPr>
       <w:r>
+        <w:lastRenderedPageBreak/>
         <w:t xml:space="preserve"> </w:t>
       </w:r>
     </w:p>
@@ -6722,7 +6766,6 @@
         <w:tblCellMar>
           <w:top w:w="3" w:type="dxa"/>
           <w:left w:w="105" w:type="dxa"/>
-          <w:bottom w:w="0" w:type="dxa"/>
           <w:right w:w="63" w:type="dxa"/>
         </w:tblCellMar>
         <w:tblLook w:val="04A0" w:firstRow="1" w:lastRow="0" w:firstColumn="1" w:lastColumn="0" w:noHBand="0" w:noVBand="1"/>
@@ -6884,23 +6927,7 @@
                 <w:b/>
                 <w:color w:val="124F1A"/>
               </w:rPr>
-              <w:t xml:space="preserve">Desarrollo del sistema de visualización de stock en </w:t>
-            </w:r>
-            <w:proofErr w:type="spellStart"/>
-            <w:r>
-              <w:rPr>
-                <w:b/>
-                <w:color w:val="124F1A"/>
-              </w:rPr>
-              <w:t>React</w:t>
-            </w:r>
-            <w:proofErr w:type="spellEnd"/>
-            <w:r>
-              <w:rPr>
-                <w:b/>
-                <w:color w:val="124F1A"/>
-              </w:rPr>
-              <w:t xml:space="preserve"> </w:t>
+              <w:t xml:space="preserve">Desarrollo del sistema de visualización de stock en React </w:t>
             </w:r>
           </w:p>
         </w:tc>
@@ -7361,19 +7388,11 @@
               <w:spacing w:after="0" w:line="259" w:lineRule="auto"/>
               <w:ind w:left="3" w:firstLine="0"/>
             </w:pPr>
-            <w:proofErr w:type="spellStart"/>
-            <w:r>
-              <w:rPr>
-                <w:color w:val="124F1A"/>
-              </w:rPr>
-              <w:t>React</w:t>
-            </w:r>
-            <w:proofErr w:type="spellEnd"/>
-            <w:r>
-              <w:rPr>
-                <w:color w:val="124F1A"/>
-              </w:rPr>
-              <w:t xml:space="preserve"> y Django. </w:t>
+            <w:r>
+              <w:rPr>
+                <w:color w:val="124F1A"/>
+              </w:rPr>
+              <w:t xml:space="preserve">React y Django. </w:t>
             </w:r>
           </w:p>
         </w:tc>
@@ -7430,9 +7449,7 @@
         <w:tblW w:w="8495" w:type="dxa"/>
         <w:tblInd w:w="7" w:type="dxa"/>
         <w:tblCellMar>
-          <w:top w:w="0" w:type="dxa"/>
           <w:left w:w="105" w:type="dxa"/>
-          <w:bottom w:w="0" w:type="dxa"/>
           <w:right w:w="59" w:type="dxa"/>
         </w:tblCellMar>
         <w:tblLook w:val="04A0" w:firstRow="1" w:lastRow="0" w:firstColumn="1" w:lastColumn="0" w:noHBand="0" w:noVBand="1"/>
@@ -7719,6 +7736,7 @@
                 <w:b/>
                 <w:color w:val="124F1A"/>
               </w:rPr>
+              <w:lastRenderedPageBreak/>
               <w:t xml:space="preserve">Corrección de errores encontrados </w:t>
             </w:r>
           </w:p>
@@ -8001,9 +8019,183 @@
         <w:spacing w:after="0" w:line="259" w:lineRule="auto"/>
         <w:ind w:left="0" w:firstLine="0"/>
       </w:pPr>
-      <w:r>
-        <w:t xml:space="preserve"> </w:t>
-      </w:r>
+    </w:p>
+    <w:p>
+      <w:pPr>
+        <w:rPr>
+          <w:b/>
+          <w:bCs/>
+        </w:rPr>
+      </w:pPr>
+      <w:r>
+        <w:rPr>
+          <w:b/>
+          <w:bCs/>
+        </w:rPr>
+        <w:t>Historia de Usuario 1: Como administrador</w:t>
+      </w:r>
+    </w:p>
+    <w:p>
+      <w:pPr>
+        <w:numPr>
+          <w:ilvl w:val="0"/>
+          <w:numId w:val="2"/>
+        </w:numPr>
+      </w:pPr>
+      <w:r>
+        <w:t xml:space="preserve">Quiero poder configurar el entorno de desarrollo para el </w:t>
+      </w:r>
+      <w:proofErr w:type="spellStart"/>
+      <w:r>
+        <w:t>frontend</w:t>
+      </w:r>
+      <w:proofErr w:type="spellEnd"/>
+      <w:r>
+        <w:t xml:space="preserve"> y el </w:t>
+      </w:r>
+      <w:proofErr w:type="spellStart"/>
+      <w:r>
+        <w:t>backend</w:t>
+      </w:r>
+      <w:proofErr w:type="spellEnd"/>
+      <w:r>
+        <w:t>,</w:t>
+      </w:r>
+    </w:p>
+    <w:p>
+      <w:pPr>
+        <w:numPr>
+          <w:ilvl w:val="0"/>
+          <w:numId w:val="2"/>
+        </w:numPr>
+      </w:pPr>
+      <w:r>
+        <w:t>Para que el sistema esté listo para implementar funcionalidades.</w:t>
+      </w:r>
+      <w:r>
+        <w:br/>
+        <w:t>Criterios de aceptación:</w:t>
+      </w:r>
+    </w:p>
+    <w:p>
+      <w:pPr>
+        <w:numPr>
+          <w:ilvl w:val="1"/>
+          <w:numId w:val="2"/>
+        </w:numPr>
+      </w:pPr>
+      <w:r>
+        <w:t>React y Django están instalados y funcionan en sus servidores locales.</w:t>
+      </w:r>
+    </w:p>
+    <w:p>
+      <w:pPr>
+        <w:numPr>
+          <w:ilvl w:val="1"/>
+          <w:numId w:val="2"/>
+        </w:numPr>
+        <w:rPr>
+          <w:b/>
+        </w:rPr>
+      </w:pPr>
+      <w:r>
+        <w:t>Las tablas de la base de datos están listas y reflejan los requisitos iniciales.</w:t>
+      </w:r>
+    </w:p>
+    <w:p>
+      <w:pPr>
+        <w:rPr>
+          <w:b/>
+          <w:bCs/>
+        </w:rPr>
+      </w:pPr>
+      <w:r>
+        <w:rPr>
+          <w:b/>
+          <w:bCs/>
+        </w:rPr>
+        <w:t>Historia de Usuario 2: Como administrador</w:t>
+      </w:r>
+    </w:p>
+    <w:p>
+      <w:pPr>
+        <w:numPr>
+          <w:ilvl w:val="0"/>
+          <w:numId w:val="3"/>
+        </w:numPr>
+      </w:pPr>
+      <w:r>
+        <w:t xml:space="preserve">Quiero visualizar diseños claros en </w:t>
+      </w:r>
+      <w:proofErr w:type="spellStart"/>
+      <w:r>
+        <w:t>Figma</w:t>
+      </w:r>
+      <w:proofErr w:type="spellEnd"/>
+      <w:r>
+        <w:t>,</w:t>
+      </w:r>
+    </w:p>
+    <w:p>
+      <w:pPr>
+        <w:numPr>
+          <w:ilvl w:val="0"/>
+          <w:numId w:val="3"/>
+        </w:numPr>
+      </w:pPr>
+      <w:r>
+        <w:t>Para entender cómo será la interfaz de usuario antes de desarrollarla.</w:t>
+      </w:r>
+      <w:r>
+        <w:br/>
+        <w:t>Criterios de aceptación:</w:t>
+      </w:r>
+    </w:p>
+    <w:p>
+      <w:pPr>
+        <w:numPr>
+          <w:ilvl w:val="1"/>
+          <w:numId w:val="3"/>
+        </w:numPr>
+      </w:pPr>
+      <w:r>
+        <w:t xml:space="preserve">El diseño del </w:t>
+      </w:r>
+      <w:proofErr w:type="spellStart"/>
+      <w:r>
+        <w:t>login</w:t>
+      </w:r>
+      <w:proofErr w:type="spellEnd"/>
+      <w:r>
+        <w:t xml:space="preserve"> incluye campos como nombre de usuario y contraseña.</w:t>
+      </w:r>
+    </w:p>
+    <w:p>
+      <w:pPr>
+        <w:numPr>
+          <w:ilvl w:val="1"/>
+          <w:numId w:val="3"/>
+        </w:numPr>
+      </w:pPr>
+      <w:r>
+        <w:t>El dashboard muestra estadísticas clave y accesos rápidos.</w:t>
+      </w:r>
+    </w:p>
+    <w:p>
+      <w:pPr>
+        <w:numPr>
+          <w:ilvl w:val="1"/>
+          <w:numId w:val="3"/>
+        </w:numPr>
+      </w:pPr>
+      <w:r>
+        <w:t>El formulario de gestión de productos permite agregar, editar y eliminar.</w:t>
+      </w:r>
+    </w:p>
+    <w:p>
+      <w:pPr>
+        <w:ind w:left="0" w:firstLine="0"/>
+      </w:pPr>
     </w:p>
     <w:p>
       <w:pPr>
@@ -8014,20 +8206,20 @@
         <w:rPr>
           <w:b/>
         </w:rPr>
-        <w:t xml:space="preserve">Historias de Usuario </w:t>
-      </w:r>
-    </w:p>
-    <w:p>
-      <w:pPr>
-        <w:spacing w:after="183" w:line="259" w:lineRule="auto"/>
-        <w:ind w:left="-5"/>
-      </w:pPr>
-      <w:r>
-        <w:rPr>
-          <w:b/>
-        </w:rPr>
         <w:lastRenderedPageBreak/>
-        <w:t xml:space="preserve">Historia de Usuario 1: </w:t>
+        <w:t xml:space="preserve">Historia de Usuario </w:t>
+      </w:r>
+      <w:r>
+        <w:rPr>
+          <w:b/>
+        </w:rPr>
+        <w:t>3</w:t>
+      </w:r>
+      <w:r>
+        <w:rPr>
+          <w:b/>
+        </w:rPr>
+        <w:t xml:space="preserve">: </w:t>
       </w:r>
     </w:p>
     <w:p>
@@ -8041,13 +8233,13 @@
         <w:t>Título</w:t>
       </w:r>
       <w:r>
-        <w:t xml:space="preserve">: Registro de productos en el inventario </w:t>
+        <w:t xml:space="preserve">: Autenticación de usuario </w:t>
       </w:r>
     </w:p>
     <w:p>
       <w:pPr>
         <w:spacing w:after="162" w:line="278" w:lineRule="auto"/>
-        <w:ind w:left="-5" w:right="533"/>
+        <w:ind w:left="-5" w:right="360"/>
         <w:jc w:val="both"/>
       </w:pPr>
       <w:r>
@@ -8063,19 +8255,19 @@
         <w:rPr>
           <w:b/>
         </w:rPr>
-        <w:t>administrador</w:t>
-      </w:r>
-      <w:r>
-        <w:t xml:space="preserve">, quiero </w:t>
-      </w:r>
-      <w:r>
-        <w:rPr>
-          <w:b/>
-        </w:rPr>
-        <w:t>registrar nuevos productos</w:t>
-      </w:r>
-      <w:r>
-        <w:t xml:space="preserve"> en el inventario para llevar un control adecuado de los artículos disponibles. </w:t>
+        <w:t>usuario</w:t>
+      </w:r>
+      <w:r>
+        <w:t xml:space="preserve">, quiero poder </w:t>
+      </w:r>
+      <w:r>
+        <w:rPr>
+          <w:b/>
+        </w:rPr>
+        <w:t>iniciar sesión</w:t>
+      </w:r>
+      <w:r>
+        <w:t xml:space="preserve"> con mis credenciales para acceder al sistema y gestionar los productos y ventas. </w:t>
       </w:r>
       <w:r>
         <w:rPr>
@@ -8096,7 +8288,7 @@
         <w:ind w:hanging="361"/>
       </w:pPr>
       <w:r>
-        <w:t xml:space="preserve">El sistema debe permitir ingresar nombre, categoría, precio y cantidad. </w:t>
+        <w:t xml:space="preserve">El sistema debe permitir iniciar sesión con nombre de usuario y contraseña. </w:t>
       </w:r>
     </w:p>
     <w:p>
@@ -8108,7 +8300,7 @@
         <w:ind w:hanging="361"/>
       </w:pPr>
       <w:r>
-        <w:t xml:space="preserve">Los datos registrados deben reflejarse en la base de datos correctamente. </w:t>
+        <w:t xml:space="preserve">Debe manejar correctamente los intentos fallidos y las credenciales incorrectas. </w:t>
       </w:r>
     </w:p>
     <w:p>
@@ -8120,7 +8312,7 @@
         <w:rPr>
           <w:b/>
         </w:rPr>
-        <w:t xml:space="preserve">Historia de Usuario 2: </w:t>
+        <w:t xml:space="preserve">Historia de Usuario 3: </w:t>
       </w:r>
     </w:p>
     <w:p>
@@ -8134,13 +8326,13 @@
         <w:t>Título</w:t>
       </w:r>
       <w:r>
-        <w:t xml:space="preserve">: Autenticación de usuario </w:t>
+        <w:t xml:space="preserve">: Gestión de productos </w:t>
       </w:r>
     </w:p>
     <w:p>
       <w:pPr>
         <w:spacing w:after="162" w:line="278" w:lineRule="auto"/>
-        <w:ind w:left="-5" w:right="360"/>
+        <w:ind w:left="-5" w:right="146"/>
         <w:jc w:val="both"/>
       </w:pPr>
       <w:r>
@@ -8156,19 +8348,19 @@
         <w:rPr>
           <w:b/>
         </w:rPr>
-        <w:t>usuario</w:t>
-      </w:r>
-      <w:r>
-        <w:t xml:space="preserve">, quiero poder </w:t>
-      </w:r>
-      <w:r>
-        <w:rPr>
-          <w:b/>
-        </w:rPr>
-        <w:t>iniciar sesión</w:t>
-      </w:r>
-      <w:r>
-        <w:t xml:space="preserve"> con mis credenciales para acceder al sistema y gestionar los productos y ventas. </w:t>
+        <w:t>administrador</w:t>
+      </w:r>
+      <w:r>
+        <w:t xml:space="preserve">, quiero </w:t>
+      </w:r>
+      <w:r>
+        <w:rPr>
+          <w:b/>
+        </w:rPr>
+        <w:t>agregar, editar y eliminar productos</w:t>
+      </w:r>
+      <w:r>
+        <w:t xml:space="preserve"> en el inventario para gestionar eficientemente el stock disponible. </w:t>
       </w:r>
       <w:r>
         <w:rPr>
@@ -8189,7 +8381,7 @@
         <w:ind w:hanging="361"/>
       </w:pPr>
       <w:r>
-        <w:t xml:space="preserve">El sistema debe permitir iniciar sesión con nombre de usuario y contraseña. </w:t>
+        <w:t xml:space="preserve">El sistema debe permitir agregar, editar y eliminar productos. </w:t>
       </w:r>
     </w:p>
     <w:p>
@@ -8201,7 +8393,7 @@
         <w:ind w:hanging="361"/>
       </w:pPr>
       <w:r>
-        <w:t xml:space="preserve">Debe manejar correctamente los intentos fallidos y las credenciales incorrectas. </w:t>
+        <w:t xml:space="preserve">Los cambios deben reflejarse en la base de datos correctamente. </w:t>
       </w:r>
     </w:p>
     <w:p>
@@ -8213,7 +8405,7 @@
         <w:rPr>
           <w:b/>
         </w:rPr>
-        <w:t xml:space="preserve">Historia de Usuario 3: </w:t>
+        <w:t xml:space="preserve">Historia de Usuario 4: </w:t>
       </w:r>
     </w:p>
     <w:p>
@@ -8227,13 +8419,13 @@
         <w:t>Título</w:t>
       </w:r>
       <w:r>
-        <w:t xml:space="preserve">: Gestión de productos </w:t>
+        <w:t xml:space="preserve">: Registro de ventas realizadas </w:t>
       </w:r>
     </w:p>
     <w:p>
       <w:pPr>
         <w:spacing w:after="162" w:line="278" w:lineRule="auto"/>
-        <w:ind w:left="-5" w:right="146"/>
+        <w:ind w:left="-5" w:right="959"/>
         <w:jc w:val="both"/>
       </w:pPr>
       <w:r>
@@ -8249,19 +8441,10 @@
         <w:rPr>
           <w:b/>
         </w:rPr>
-        <w:t>administrador</w:t>
-      </w:r>
-      <w:r>
-        <w:t xml:space="preserve">, quiero </w:t>
-      </w:r>
-      <w:r>
-        <w:rPr>
-          <w:b/>
-        </w:rPr>
-        <w:t>agregar, editar y eliminar productos</w:t>
-      </w:r>
-      <w:r>
-        <w:t xml:space="preserve"> en el inventario para gestionar eficientemente el stock disponible. </w:t>
+        <w:t>vendedor</w:t>
+      </w:r>
+      <w:r>
+        <w:t xml:space="preserve">, quiero registrar las ventas realizadas para actualizar automáticamente el inventario y generar reportes de ventas. </w:t>
       </w:r>
       <w:r>
         <w:rPr>
@@ -8282,7 +8465,7 @@
         <w:ind w:hanging="361"/>
       </w:pPr>
       <w:r>
-        <w:t xml:space="preserve">El sistema debe permitir agregar, editar y eliminar productos. </w:t>
+        <w:t xml:space="preserve">El sistema debe permitir registrar los productos vendidos, la cantidad, el precio y el total de la venta. </w:t>
       </w:r>
     </w:p>
     <w:p>
@@ -8294,7 +8477,7 @@
         <w:ind w:hanging="361"/>
       </w:pPr>
       <w:r>
-        <w:t xml:space="preserve">Los cambios deben reflejarse en la base de datos correctamente. </w:t>
+        <w:t xml:space="preserve">El inventario debe actualizarse automáticamente después de cada venta. </w:t>
       </w:r>
     </w:p>
     <w:p>
@@ -8306,7 +8489,7 @@
         <w:rPr>
           <w:b/>
         </w:rPr>
-        <w:t xml:space="preserve">Historia de Usuario 4: </w:t>
+        <w:t xml:space="preserve">Historia de Usuario 5: </w:t>
       </w:r>
     </w:p>
     <w:p>
@@ -8320,14 +8503,12 @@
         <w:t>Título</w:t>
       </w:r>
       <w:r>
-        <w:t xml:space="preserve">: Registro de ventas realizadas </w:t>
-      </w:r>
-    </w:p>
-    <w:p>
-      <w:pPr>
-        <w:spacing w:after="162" w:line="278" w:lineRule="auto"/>
-        <w:ind w:left="-5" w:right="959"/>
-        <w:jc w:val="both"/>
+        <w:t xml:space="preserve">: Predicción de demanda de productos </w:t>
+      </w:r>
+    </w:p>
+    <w:p>
+      <w:pPr>
+        <w:ind w:right="819"/>
       </w:pPr>
       <w:r>
         <w:rPr>
@@ -8342,10 +8523,19 @@
         <w:rPr>
           <w:b/>
         </w:rPr>
-        <w:t>vendedor</w:t>
-      </w:r>
-      <w:r>
-        <w:t xml:space="preserve">, quiero registrar las ventas realizadas para actualizar automáticamente el inventario y generar reportes de ventas. </w:t>
+        <w:t>administrador</w:t>
+      </w:r>
+      <w:r>
+        <w:t xml:space="preserve">, quiero que el sistema utilice </w:t>
+      </w:r>
+      <w:r>
+        <w:rPr>
+          <w:b/>
+        </w:rPr>
+        <w:t>Machine Learning</w:t>
+      </w:r>
+      <w:r>
+        <w:t xml:space="preserve"> para predecir la demanda futura de productos para optimizar el inventario y evitar faltantes o excesos. </w:t>
       </w:r>
       <w:r>
         <w:rPr>
@@ -8366,7 +8556,7 @@
         <w:ind w:hanging="361"/>
       </w:pPr>
       <w:r>
-        <w:t xml:space="preserve">El sistema debe permitir registrar los productos vendidos, la cantidad, el precio y el total de la venta. </w:t>
+        <w:t xml:space="preserve">El sistema debe generar predicciones de demanda futura para cada producto. </w:t>
       </w:r>
     </w:p>
     <w:p>
@@ -8378,7 +8568,7 @@
         <w:ind w:hanging="361"/>
       </w:pPr>
       <w:r>
-        <w:t xml:space="preserve">El inventario debe actualizarse automáticamente después de cada venta. </w:t>
+        <w:t xml:space="preserve">Los resultados deben ser mostrados de manera clara y comprensible en la interfaz de usuario. </w:t>
       </w:r>
     </w:p>
     <w:p>
@@ -8390,12 +8580,12 @@
         <w:rPr>
           <w:b/>
         </w:rPr>
-        <w:t xml:space="preserve">Historia de Usuario 5: </w:t>
-      </w:r>
-    </w:p>
-    <w:p>
-      <w:pPr>
-        <w:spacing w:after="13"/>
+        <w:t xml:space="preserve">Historia de Usuario 6: </w:t>
+      </w:r>
+    </w:p>
+    <w:p>
+      <w:pPr>
+        <w:spacing w:after="9"/>
       </w:pPr>
       <w:r>
         <w:rPr>
@@ -8404,12 +8594,14 @@
         <w:t>Título</w:t>
       </w:r>
       <w:r>
-        <w:t xml:space="preserve">: Predicción de demanda de productos </w:t>
-      </w:r>
-    </w:p>
-    <w:p>
-      <w:pPr>
-        <w:ind w:right="819"/>
+        <w:t xml:space="preserve">: Generación de reportes de ventas </w:t>
+      </w:r>
+    </w:p>
+    <w:p>
+      <w:pPr>
+        <w:spacing w:after="162" w:line="278" w:lineRule="auto"/>
+        <w:ind w:left="-5" w:right="15"/>
+        <w:jc w:val="both"/>
       </w:pPr>
       <w:r>
         <w:rPr>
@@ -8427,16 +8619,7 @@
         <w:t>administrador</w:t>
       </w:r>
       <w:r>
-        <w:t xml:space="preserve">, quiero que el sistema utilice </w:t>
-      </w:r>
-      <w:r>
-        <w:rPr>
-          <w:b/>
-        </w:rPr>
-        <w:t>Machine Learning</w:t>
-      </w:r>
-      <w:r>
-        <w:t xml:space="preserve"> para predecir la demanda futura de productos para optimizar el inventario y evitar faltantes o excesos. </w:t>
+        <w:t xml:space="preserve">, quiero generar reportes de ventas por periodo para analizar el rendimiento de las ventas y tomar decisiones informadas. </w:t>
       </w:r>
       <w:r>
         <w:rPr>
@@ -8458,7 +8641,7 @@
       </w:pPr>
       <w:r>
         <w:lastRenderedPageBreak/>
-        <w:t xml:space="preserve">El sistema debe generar predicciones de demanda futura para cada producto. </w:t>
+        <w:t xml:space="preserve">El sistema debe permitir generar reportes de ventas por fecha, producto y otras métricas. </w:t>
       </w:r>
     </w:p>
     <w:p>
@@ -8470,7 +8653,7 @@
         <w:ind w:hanging="361"/>
       </w:pPr>
       <w:r>
-        <w:t xml:space="preserve">Los resultados deben ser mostrados de manera clara y comprensible en la interfaz de usuario. </w:t>
+        <w:t xml:space="preserve">Los reportes deben ser exportables en formatos como CSV o PDF. </w:t>
       </w:r>
     </w:p>
     <w:p>
@@ -8482,12 +8665,12 @@
         <w:rPr>
           <w:b/>
         </w:rPr>
-        <w:t xml:space="preserve">Historia de Usuario 6: </w:t>
-      </w:r>
-    </w:p>
-    <w:p>
-      <w:pPr>
-        <w:spacing w:after="9"/>
+        <w:t xml:space="preserve">Historia de Usuario 7: </w:t>
+      </w:r>
+    </w:p>
+    <w:p>
+      <w:pPr>
+        <w:spacing w:after="13"/>
       </w:pPr>
       <w:r>
         <w:rPr>
@@ -8496,13 +8679,13 @@
         <w:t>Título</w:t>
       </w:r>
       <w:r>
-        <w:t xml:space="preserve">: Generación de reportes de ventas </w:t>
+        <w:t xml:space="preserve">: Actualización de precios </w:t>
       </w:r>
     </w:p>
     <w:p>
       <w:pPr>
         <w:spacing w:after="162" w:line="278" w:lineRule="auto"/>
-        <w:ind w:left="-5" w:right="15"/>
+        <w:ind w:left="-5" w:right="474"/>
         <w:jc w:val="both"/>
       </w:pPr>
       <w:r>
@@ -8521,7 +8704,7 @@
         <w:t>administrador</w:t>
       </w:r>
       <w:r>
-        <w:t xml:space="preserve">, quiero generar reportes de ventas por periodo para analizar el rendimiento de las ventas y tomar decisiones informadas. </w:t>
+        <w:t xml:space="preserve">, quiero poder actualizar los precios de los productos para asegurarme de que siempre se reflejen las tarifas correctas en todas las ventas. </w:t>
       </w:r>
       <w:r>
         <w:rPr>
@@ -8542,7 +8725,7 @@
         <w:ind w:hanging="361"/>
       </w:pPr>
       <w:r>
-        <w:t xml:space="preserve">El sistema debe permitir generar reportes de ventas por fecha, producto y otras métricas. </w:t>
+        <w:t xml:space="preserve">El sistema debe permitir actualizar los precios de los productos de manera sencilla. </w:t>
       </w:r>
     </w:p>
     <w:p>
@@ -8554,7 +8737,7 @@
         <w:ind w:hanging="361"/>
       </w:pPr>
       <w:r>
-        <w:t xml:space="preserve">Los reportes deben ser exportables en formatos como CSV o PDF. </w:t>
+        <w:t xml:space="preserve">Los cambios deben reflejarse en todas las transacciones futuras. </w:t>
       </w:r>
     </w:p>
     <w:p>
@@ -8566,7 +8749,7 @@
         <w:rPr>
           <w:b/>
         </w:rPr>
-        <w:t xml:space="preserve">Historia de Usuario 7: </w:t>
+        <w:t xml:space="preserve">Historia de Usuario 8: </w:t>
       </w:r>
     </w:p>
     <w:p>
@@ -8580,14 +8763,12 @@
         <w:t>Título</w:t>
       </w:r>
       <w:r>
-        <w:t xml:space="preserve">: Actualización de precios </w:t>
-      </w:r>
-    </w:p>
-    <w:p>
-      <w:pPr>
-        <w:spacing w:after="162" w:line="278" w:lineRule="auto"/>
-        <w:ind w:left="-5" w:right="474"/>
-        <w:jc w:val="both"/>
+        <w:t xml:space="preserve">: Gestión de proveedores </w:t>
+      </w:r>
+    </w:p>
+    <w:p>
+      <w:pPr>
+        <w:spacing w:after="10"/>
       </w:pPr>
       <w:r>
         <w:rPr>
@@ -8605,8 +8786,14 @@
         <w:t>administrador</w:t>
       </w:r>
       <w:r>
-        <w:t xml:space="preserve">, quiero poder actualizar los precios de los productos para asegurarme de que siempre se reflejen las tarifas correctas en todas las ventas. </w:t>
-      </w:r>
+        <w:t xml:space="preserve">, quiero gestionar los proveedores para tener un registro actualizado de las compras realizadas y los proveedores con los que trabajo. </w:t>
+      </w:r>
+    </w:p>
+    <w:p>
+      <w:pPr>
+        <w:spacing w:after="183" w:line="259" w:lineRule="auto"/>
+        <w:ind w:left="-5"/>
+      </w:pPr>
       <w:r>
         <w:rPr>
           <w:b/>
@@ -8626,7 +8813,7 @@
         <w:ind w:hanging="361"/>
       </w:pPr>
       <w:r>
-        <w:t xml:space="preserve">El sistema debe permitir actualizar los precios de los productos de manera sencilla. </w:t>
+        <w:t xml:space="preserve">El sistema debe permitir agregar, editar y eliminar proveedores. </w:t>
       </w:r>
     </w:p>
     <w:p>
@@ -8638,7 +8825,7 @@
         <w:ind w:hanging="361"/>
       </w:pPr>
       <w:r>
-        <w:t xml:space="preserve">Los cambios deben reflejarse en todas las transacciones futuras. </w:t>
+        <w:t xml:space="preserve">Los proveedores deben estar registrados correctamente en la base de datos. </w:t>
       </w:r>
     </w:p>
     <w:p>
@@ -8650,12 +8837,12 @@
         <w:rPr>
           <w:b/>
         </w:rPr>
-        <w:t xml:space="preserve">Historia de Usuario 8: </w:t>
-      </w:r>
-    </w:p>
-    <w:p>
-      <w:pPr>
-        <w:spacing w:after="13"/>
+        <w:t xml:space="preserve">Historia de Usuario 9: </w:t>
+      </w:r>
+    </w:p>
+    <w:p>
+      <w:pPr>
+        <w:spacing w:after="14"/>
       </w:pPr>
       <w:r>
         <w:rPr>
@@ -8664,12 +8851,14 @@
         <w:t>Título</w:t>
       </w:r>
       <w:r>
-        <w:t xml:space="preserve">: Gestión de proveedores </w:t>
-      </w:r>
-    </w:p>
-    <w:p>
-      <w:pPr>
-        <w:spacing w:after="10"/>
+        <w:t xml:space="preserve">: Control de stock </w:t>
+      </w:r>
+    </w:p>
+    <w:p>
+      <w:pPr>
+        <w:spacing w:after="162" w:line="278" w:lineRule="auto"/>
+        <w:ind w:left="-5" w:right="220"/>
+        <w:jc w:val="both"/>
       </w:pPr>
       <w:r>
         <w:rPr>
@@ -8687,14 +8876,8 @@
         <w:t>administrador</w:t>
       </w:r>
       <w:r>
-        <w:t xml:space="preserve">, quiero gestionar los proveedores para tener un registro actualizado de las compras realizadas y los proveedores con los que trabajo. </w:t>
-      </w:r>
-    </w:p>
-    <w:p>
-      <w:pPr>
-        <w:spacing w:after="183" w:line="259" w:lineRule="auto"/>
-        <w:ind w:left="-5"/>
-      </w:pPr>
+        <w:t xml:space="preserve">, quiero ver y actualizar el stock de los productos en tiempo real para tener un control preciso del inventario disponible. </w:t>
+      </w:r>
       <w:r>
         <w:rPr>
           <w:b/>
@@ -8714,7 +8897,7 @@
         <w:ind w:hanging="361"/>
       </w:pPr>
       <w:r>
-        <w:t xml:space="preserve">El sistema debe permitir agregar, editar y eliminar proveedores. </w:t>
+        <w:t xml:space="preserve">El sistema debe permitir ver el stock disponible de cada producto. </w:t>
       </w:r>
     </w:p>
     <w:p>
@@ -8726,7 +8909,7 @@
         <w:ind w:hanging="361"/>
       </w:pPr>
       <w:r>
-        <w:t xml:space="preserve">Los proveedores deben estar registrados correctamente en la base de datos. </w:t>
+        <w:t xml:space="preserve">El stock debe actualizarse automáticamente tras cada venta o ingreso. </w:t>
       </w:r>
     </w:p>
     <w:p>
@@ -8738,12 +8921,12 @@
         <w:rPr>
           <w:b/>
         </w:rPr>
-        <w:t xml:space="preserve">Historia de Usuario 9: </w:t>
-      </w:r>
-    </w:p>
-    <w:p>
-      <w:pPr>
-        <w:spacing w:after="14"/>
+        <w:t xml:space="preserve">Historia de Usuario 10: </w:t>
+      </w:r>
+    </w:p>
+    <w:p>
+      <w:pPr>
+        <w:spacing w:after="9"/>
       </w:pPr>
       <w:r>
         <w:rPr>
@@ -8752,14 +8935,12 @@
         <w:t>Título</w:t>
       </w:r>
       <w:r>
-        <w:t xml:space="preserve">: Control de stock </w:t>
-      </w:r>
-    </w:p>
-    <w:p>
-      <w:pPr>
-        <w:spacing w:after="162" w:line="278" w:lineRule="auto"/>
-        <w:ind w:left="-5" w:right="220"/>
-        <w:jc w:val="both"/>
+        <w:t xml:space="preserve">: Control de transacciones </w:t>
+      </w:r>
+    </w:p>
+    <w:p>
+      <w:pPr>
+        <w:spacing w:after="9"/>
       </w:pPr>
       <w:r>
         <w:rPr>
@@ -8777,8 +8958,14 @@
         <w:t>administrador</w:t>
       </w:r>
       <w:r>
-        <w:t xml:space="preserve">, quiero ver y actualizar el stock de los productos en tiempo real para tener un control preciso del inventario disponible. </w:t>
-      </w:r>
+        <w:t xml:space="preserve">, quiero tener un registro detallado de todas las transacciones realizadas para poder hacer auditorías y controlar las ganancias del negocio. </w:t>
+      </w:r>
+    </w:p>
+    <w:p>
+      <w:pPr>
+        <w:spacing w:after="183" w:line="259" w:lineRule="auto"/>
+        <w:ind w:left="-5"/>
+      </w:pPr>
       <w:r>
         <w:rPr>
           <w:b/>
@@ -8798,7 +8985,7 @@
         <w:ind w:hanging="361"/>
       </w:pPr>
       <w:r>
-        <w:t xml:space="preserve">El sistema debe permitir ver el stock disponible de cada producto. </w:t>
+        <w:t xml:space="preserve">El sistema debe registrar cada transacción de manera detallada. </w:t>
       </w:r>
     </w:p>
     <w:p>
@@ -8810,7 +8997,7 @@
         <w:ind w:hanging="361"/>
       </w:pPr>
       <w:r>
-        <w:t xml:space="preserve">El stock debe actualizarse automáticamente tras cada venta o ingreso. </w:t>
+        <w:t xml:space="preserve">Las transacciones deben estar accesibles para consultas e informes. </w:t>
       </w:r>
     </w:p>
     <w:p>
@@ -8823,12 +9010,12 @@
           <w:b/>
         </w:rPr>
         <w:lastRenderedPageBreak/>
-        <w:t xml:space="preserve">Historia de Usuario 10: </w:t>
-      </w:r>
-    </w:p>
-    <w:p>
-      <w:pPr>
-        <w:spacing w:after="9"/>
+        <w:t xml:space="preserve">Historia de Usuario 11: </w:t>
+      </w:r>
+    </w:p>
+    <w:p>
+      <w:pPr>
+        <w:spacing w:after="13"/>
       </w:pPr>
       <w:r>
         <w:rPr>
@@ -8837,12 +9024,14 @@
         <w:t>Título</w:t>
       </w:r>
       <w:r>
-        <w:t xml:space="preserve">: Control de transacciones </w:t>
-      </w:r>
-    </w:p>
-    <w:p>
-      <w:pPr>
-        <w:spacing w:after="9"/>
+        <w:t xml:space="preserve">: Gestión del flujo de caja </w:t>
+      </w:r>
+    </w:p>
+    <w:p>
+      <w:pPr>
+        <w:spacing w:after="162" w:line="278" w:lineRule="auto"/>
+        <w:ind w:left="-5" w:right="220"/>
+        <w:jc w:val="both"/>
       </w:pPr>
       <w:r>
         <w:rPr>
@@ -8860,14 +9049,8 @@
         <w:t>administrador</w:t>
       </w:r>
       <w:r>
-        <w:t xml:space="preserve">, quiero tener un registro detallado de todas las transacciones realizadas para poder hacer auditorías y controlar las ganancias del negocio. </w:t>
-      </w:r>
-    </w:p>
-    <w:p>
-      <w:pPr>
-        <w:spacing w:after="183" w:line="259" w:lineRule="auto"/>
-        <w:ind w:left="-5"/>
-      </w:pPr>
+        <w:t xml:space="preserve">, quiero gestionar el flujo de caja, registrando ingresos y egresos de dinero para tener un control de las finanzas del negocio. </w:t>
+      </w:r>
       <w:r>
         <w:rPr>
           <w:b/>
@@ -8887,7 +9070,7 @@
         <w:ind w:hanging="361"/>
       </w:pPr>
       <w:r>
-        <w:t xml:space="preserve">El sistema debe registrar cada transacción de manera detallada. </w:t>
+        <w:t xml:space="preserve">El sistema debe permitir registrar ingresos y egresos de dinero. </w:t>
       </w:r>
     </w:p>
     <w:p>
@@ -8899,7 +9082,7 @@
         <w:ind w:hanging="361"/>
       </w:pPr>
       <w:r>
-        <w:t xml:space="preserve">Las transacciones deben estar accesibles para consultas e informes. </w:t>
+        <w:t xml:space="preserve">Los registros deben reflejarse correctamente en la base de datos. </w:t>
       </w:r>
     </w:p>
     <w:p>
@@ -8911,7 +9094,7 @@
         <w:rPr>
           <w:b/>
         </w:rPr>
-        <w:t xml:space="preserve">Historia de Usuario 11: </w:t>
+        <w:t xml:space="preserve">Historia de Usuario 12: </w:t>
       </w:r>
     </w:p>
     <w:p>
@@ -8925,13 +9108,13 @@
         <w:t>Título</w:t>
       </w:r>
       <w:r>
-        <w:t xml:space="preserve">: Gestión del flujo de caja </w:t>
+        <w:t xml:space="preserve">: Sistema libre de errores </w:t>
       </w:r>
     </w:p>
     <w:p>
       <w:pPr>
         <w:spacing w:after="162" w:line="278" w:lineRule="auto"/>
-        <w:ind w:left="-5" w:right="220"/>
+        <w:ind w:left="-5" w:right="312"/>
         <w:jc w:val="both"/>
       </w:pPr>
       <w:r>
@@ -8947,10 +9130,10 @@
         <w:rPr>
           <w:b/>
         </w:rPr>
-        <w:t>administrador</w:t>
-      </w:r>
-      <w:r>
-        <w:t xml:space="preserve">, quiero gestionar el flujo de caja, registrando ingresos y egresos de dinero para tener un control de las finanzas del negocio. </w:t>
+        <w:t>usuario</w:t>
+      </w:r>
+      <w:r>
+        <w:t xml:space="preserve">, quiero que el sistema funcione correctamente sin errores para que mi experiencia sea fluida y confiable. </w:t>
       </w:r>
       <w:r>
         <w:rPr>
@@ -8971,7 +9154,94 @@
         <w:ind w:hanging="361"/>
       </w:pPr>
       <w:r>
-        <w:t xml:space="preserve">El sistema debe permitir registrar ingresos y egresos de dinero. </w:t>
+        <w:t xml:space="preserve">El sistema debe ser probado exhaustivamente y libre de errores críticos. </w:t>
+      </w:r>
+    </w:p>
+    <w:p>
+      <w:pPr>
+        <w:spacing w:after="184" w:line="259" w:lineRule="auto"/>
+        <w:ind w:left="0" w:firstLine="0"/>
+      </w:pPr>
+      <w:r>
+        <w:t xml:space="preserve"> </w:t>
+      </w:r>
+    </w:p>
+    <w:p>
+      <w:pPr>
+        <w:spacing w:after="0" w:line="259" w:lineRule="auto"/>
+        <w:ind w:left="0" w:firstLine="0"/>
+      </w:pPr>
+      <w:r>
+        <w:t xml:space="preserve"> </w:t>
+      </w:r>
+    </w:p>
+    <w:p>
+      <w:pPr>
+        <w:spacing w:after="0" w:line="409" w:lineRule="auto"/>
+        <w:ind w:left="-5" w:right="5584"/>
+      </w:pPr>
+      <w:r>
+        <w:rPr>
+          <w:b/>
+        </w:rPr>
+        <w:t xml:space="preserve">Historias Técnicas Historia Técnica 1: </w:t>
+      </w:r>
+    </w:p>
+    <w:p>
+      <w:pPr>
+        <w:ind w:right="225"/>
+      </w:pPr>
+      <w:r>
+        <w:rPr>
+          <w:b/>
+        </w:rPr>
+        <w:t>Título</w:t>
+      </w:r>
+      <w:r>
+        <w:t xml:space="preserve">: Implementación del registro de productos en el inventario </w:t>
+      </w:r>
+      <w:r>
+        <w:rPr>
+          <w:b/>
+        </w:rPr>
+        <w:t>Descripción</w:t>
+      </w:r>
+      <w:r>
+        <w:t xml:space="preserve">: Como desarrollador, debo crear los </w:t>
+      </w:r>
+      <w:proofErr w:type="spellStart"/>
+      <w:r>
+        <w:rPr>
+          <w:b/>
+        </w:rPr>
+        <w:t>endpoints</w:t>
+      </w:r>
+      <w:proofErr w:type="spellEnd"/>
+      <w:r>
+        <w:rPr>
+          <w:b/>
+        </w:rPr>
+        <w:t xml:space="preserve"> </w:t>
+      </w:r>
+      <w:proofErr w:type="spellStart"/>
+      <w:r>
+        <w:rPr>
+          <w:b/>
+        </w:rPr>
+        <w:t>RESTful</w:t>
+      </w:r>
+      <w:proofErr w:type="spellEnd"/>
+      <w:r>
+        <w:t xml:space="preserve"> para registrar productos en el inventario y asegurarme de que los datos se almacenen correctamente en la base de datos. </w:t>
+      </w:r>
+      <w:r>
+        <w:rPr>
+          <w:b/>
+        </w:rPr>
+        <w:t>Criterios de Aceptación</w:t>
+      </w:r>
+      <w:r>
+        <w:t xml:space="preserve">: </w:t>
       </w:r>
     </w:p>
     <w:p>
@@ -8983,67 +9253,15 @@
         <w:ind w:hanging="361"/>
       </w:pPr>
       <w:r>
-        <w:t xml:space="preserve">Los registros deben reflejarse correctamente en la base de datos. </w:t>
-      </w:r>
-    </w:p>
-    <w:p>
-      <w:pPr>
-        <w:spacing w:after="183" w:line="259" w:lineRule="auto"/>
-        <w:ind w:left="-5"/>
-      </w:pPr>
-      <w:r>
-        <w:rPr>
-          <w:b/>
-        </w:rPr>
-        <w:t xml:space="preserve">Historia de Usuario 12: </w:t>
-      </w:r>
-    </w:p>
-    <w:p>
-      <w:pPr>
-        <w:spacing w:after="13"/>
-      </w:pPr>
-      <w:r>
-        <w:rPr>
-          <w:b/>
-        </w:rPr>
-        <w:t>Título</w:t>
-      </w:r>
-      <w:r>
-        <w:t xml:space="preserve">: Sistema libre de errores </w:t>
-      </w:r>
-    </w:p>
-    <w:p>
-      <w:pPr>
-        <w:spacing w:after="162" w:line="278" w:lineRule="auto"/>
-        <w:ind w:left="-5" w:right="312"/>
-        <w:jc w:val="both"/>
-      </w:pPr>
-      <w:r>
-        <w:rPr>
-          <w:b/>
-        </w:rPr>
-        <w:t>Descripción</w:t>
-      </w:r>
-      <w:r>
-        <w:t xml:space="preserve">: Como </w:t>
-      </w:r>
-      <w:r>
-        <w:rPr>
-          <w:b/>
-        </w:rPr>
-        <w:t>usuario</w:t>
-      </w:r>
-      <w:r>
-        <w:t xml:space="preserve">, quiero que el sistema funcione correctamente sin errores para que mi experiencia sea fluida y confiable. </w:t>
-      </w:r>
-      <w:r>
-        <w:rPr>
-          <w:b/>
-        </w:rPr>
-        <w:t>Criterios de Aceptación</w:t>
-      </w:r>
-      <w:r>
-        <w:t xml:space="preserve">: </w:t>
+        <w:t xml:space="preserve">Crear un </w:t>
+      </w:r>
+      <w:proofErr w:type="spellStart"/>
+      <w:r>
+        <w:t>endpoint</w:t>
+      </w:r>
+      <w:proofErr w:type="spellEnd"/>
+      <w:r>
+        <w:t xml:space="preserve"> en Django para manejar el registro de productos. </w:t>
       </w:r>
     </w:p>
     <w:p>
@@ -9055,42 +9273,24 @@
         <w:ind w:hanging="361"/>
       </w:pPr>
       <w:r>
-        <w:t xml:space="preserve">El sistema debe ser probado exhaustivamente y libre de errores críticos. </w:t>
-      </w:r>
-    </w:p>
-    <w:p>
-      <w:pPr>
-        <w:spacing w:after="184" w:line="259" w:lineRule="auto"/>
-        <w:ind w:left="0" w:firstLine="0"/>
-      </w:pPr>
-      <w:r>
-        <w:t xml:space="preserve"> </w:t>
-      </w:r>
-    </w:p>
-    <w:p>
-      <w:pPr>
-        <w:spacing w:after="0" w:line="259" w:lineRule="auto"/>
-        <w:ind w:left="0" w:firstLine="0"/>
-      </w:pPr>
-      <w:r>
-        <w:t xml:space="preserve"> </w:t>
-      </w:r>
-    </w:p>
-    <w:p>
-      <w:pPr>
-        <w:spacing w:after="0" w:line="409" w:lineRule="auto"/>
-        <w:ind w:left="-5" w:right="5584"/>
-      </w:pPr>
-      <w:r>
-        <w:rPr>
-          <w:b/>
-        </w:rPr>
-        <w:t xml:space="preserve">Historias Técnicas Historia Técnica 1: </w:t>
-      </w:r>
-    </w:p>
-    <w:p>
-      <w:pPr>
-        <w:ind w:right="225"/>
+        <w:t xml:space="preserve">Validar que los productos se guarden correctamente en la base de datos PostgreSQL. </w:t>
+      </w:r>
+    </w:p>
+    <w:p>
+      <w:pPr>
+        <w:spacing w:after="183" w:line="259" w:lineRule="auto"/>
+        <w:ind w:left="-5"/>
+      </w:pPr>
+      <w:r>
+        <w:rPr>
+          <w:b/>
+        </w:rPr>
+        <w:t xml:space="preserve">Historia Técnica 2: </w:t>
+      </w:r>
+    </w:p>
+    <w:p>
+      <w:pPr>
+        <w:spacing w:after="14"/>
       </w:pPr>
       <w:r>
         <w:rPr>
@@ -9099,8 +9299,10 @@
         <w:t>Título</w:t>
       </w:r>
       <w:r>
-        <w:t xml:space="preserve">: Implementación del registro de productos en el inventario </w:t>
-      </w:r>
+        <w:t xml:space="preserve">: Implementación de la autenticación de usuarios con JWT </w:t>
+      </w:r>
+    </w:p>
+    <w:p>
       <w:r>
         <w:rPr>
           <w:b/>
@@ -9108,32 +9310,16 @@
         <w:t>Descripción</w:t>
       </w:r>
       <w:r>
-        <w:t xml:space="preserve">: Como desarrollador, debo crear los </w:t>
-      </w:r>
-      <w:proofErr w:type="spellStart"/>
-      <w:r>
-        <w:rPr>
-          <w:b/>
-        </w:rPr>
-        <w:t>endpoints</w:t>
-      </w:r>
-      <w:proofErr w:type="spellEnd"/>
-      <w:r>
-        <w:rPr>
-          <w:b/>
-        </w:rPr>
-        <w:t xml:space="preserve"> </w:t>
-      </w:r>
-      <w:proofErr w:type="spellStart"/>
-      <w:r>
-        <w:rPr>
-          <w:b/>
-        </w:rPr>
-        <w:t>RESTful</w:t>
-      </w:r>
-      <w:proofErr w:type="spellEnd"/>
-      <w:r>
-        <w:t xml:space="preserve"> para registrar productos en el inventario y asegurarme de que los datos se almacenen correctamente en la base de datos. </w:t>
+        <w:t xml:space="preserve">: Como desarrollador, debo implementar un sistema de autenticación utilizando </w:t>
+      </w:r>
+      <w:r>
+        <w:rPr>
+          <w:b/>
+        </w:rPr>
+        <w:t>tokens JWT</w:t>
+      </w:r>
+      <w:r>
+        <w:t xml:space="preserve"> para garantizar que los usuarios puedan iniciar sesión de manera segura y acceder al sistema. </w:t>
       </w:r>
       <w:r>
         <w:rPr>
@@ -9154,15 +9340,23 @@
         <w:ind w:hanging="361"/>
       </w:pPr>
       <w:r>
-        <w:t xml:space="preserve">Crear un </w:t>
+        <w:t xml:space="preserve">Crear </w:t>
       </w:r>
       <w:proofErr w:type="spellStart"/>
       <w:r>
-        <w:t>endpoint</w:t>
+        <w:t>endpoints</w:t>
       </w:r>
       <w:proofErr w:type="spellEnd"/>
       <w:r>
-        <w:t xml:space="preserve"> en Django para manejar el registro de productos. </w:t>
+        <w:t xml:space="preserve"> para el </w:t>
+      </w:r>
+      <w:proofErr w:type="spellStart"/>
+      <w:r>
+        <w:t>login</w:t>
+      </w:r>
+      <w:proofErr w:type="spellEnd"/>
+      <w:r>
+        <w:t xml:space="preserve"> y registro de usuarios utilizando Django REST Framework. </w:t>
       </w:r>
     </w:p>
     <w:p>
@@ -9174,7 +9368,7 @@
         <w:ind w:hanging="361"/>
       </w:pPr>
       <w:r>
-        <w:t xml:space="preserve">Validar que los productos se guarden correctamente en la base de datos PostgreSQL. </w:t>
+        <w:t xml:space="preserve">Los tokens JWT deben ser generados para los usuarios al iniciar sesión. </w:t>
       </w:r>
     </w:p>
     <w:p>
@@ -9186,7 +9380,7 @@
         <w:rPr>
           <w:b/>
         </w:rPr>
-        <w:t xml:space="preserve">Historia Técnica 2: </w:t>
+        <w:t xml:space="preserve">Historia Técnica 3: </w:t>
       </w:r>
     </w:p>
     <w:p>
@@ -9198,101 +9392,6 @@
           <w:b/>
         </w:rPr>
         <w:lastRenderedPageBreak/>
-        <w:t>Título</w:t>
-      </w:r>
-      <w:r>
-        <w:t xml:space="preserve">: Implementación de la autenticación de usuarios con JWT </w:t>
-      </w:r>
-    </w:p>
-    <w:p>
-      <w:r>
-        <w:rPr>
-          <w:b/>
-        </w:rPr>
-        <w:t>Descripción</w:t>
-      </w:r>
-      <w:r>
-        <w:t xml:space="preserve">: Como desarrollador, debo implementar un sistema de autenticación utilizando </w:t>
-      </w:r>
-      <w:r>
-        <w:rPr>
-          <w:b/>
-        </w:rPr>
-        <w:t>tokens JWT</w:t>
-      </w:r>
-      <w:r>
-        <w:t xml:space="preserve"> para garantizar que los usuarios puedan iniciar sesión de manera segura y acceder al sistema. </w:t>
-      </w:r>
-      <w:r>
-        <w:rPr>
-          <w:b/>
-        </w:rPr>
-        <w:t>Criterios de Aceptación</w:t>
-      </w:r>
-      <w:r>
-        <w:t xml:space="preserve">: </w:t>
-      </w:r>
-    </w:p>
-    <w:p>
-      <w:pPr>
-        <w:numPr>
-          <w:ilvl w:val="0"/>
-          <w:numId w:val="1"/>
-        </w:numPr>
-        <w:ind w:hanging="361"/>
-      </w:pPr>
-      <w:r>
-        <w:t xml:space="preserve">Crear </w:t>
-      </w:r>
-      <w:proofErr w:type="spellStart"/>
-      <w:r>
-        <w:t>endpoints</w:t>
-      </w:r>
-      <w:proofErr w:type="spellEnd"/>
-      <w:r>
-        <w:t xml:space="preserve"> para el </w:t>
-      </w:r>
-      <w:proofErr w:type="spellStart"/>
-      <w:r>
-        <w:t>login</w:t>
-      </w:r>
-      <w:proofErr w:type="spellEnd"/>
-      <w:r>
-        <w:t xml:space="preserve"> y registro de usuarios utilizando Django REST Framework. </w:t>
-      </w:r>
-    </w:p>
-    <w:p>
-      <w:pPr>
-        <w:numPr>
-          <w:ilvl w:val="0"/>
-          <w:numId w:val="1"/>
-        </w:numPr>
-        <w:ind w:hanging="361"/>
-      </w:pPr>
-      <w:r>
-        <w:t xml:space="preserve">Los tokens JWT deben ser generados para los usuarios al iniciar sesión. </w:t>
-      </w:r>
-    </w:p>
-    <w:p>
-      <w:pPr>
-        <w:spacing w:after="183" w:line="259" w:lineRule="auto"/>
-        <w:ind w:left="-5"/>
-      </w:pPr>
-      <w:r>
-        <w:rPr>
-          <w:b/>
-        </w:rPr>
-        <w:t xml:space="preserve">Historia Técnica 3: </w:t>
-      </w:r>
-    </w:p>
-    <w:p>
-      <w:pPr>
-        <w:spacing w:after="14"/>
-      </w:pPr>
-      <w:r>
-        <w:rPr>
-          <w:b/>
-        </w:rPr>
         <w:t>Título</w:t>
       </w:r>
       <w:r>
@@ -9569,15 +9668,7 @@
         <w:ind w:hanging="361"/>
       </w:pPr>
       <w:r>
-        <w:t xml:space="preserve">Los resultados deben mostrarse en la interfaz de usuario (en </w:t>
-      </w:r>
-      <w:proofErr w:type="spellStart"/>
-      <w:r>
-        <w:t>React</w:t>
-      </w:r>
-      <w:proofErr w:type="spellEnd"/>
-      <w:r>
-        <w:t xml:space="preserve">). </w:t>
+        <w:t xml:space="preserve">Los resultados deben mostrarse en la interfaz de usuario (en React). </w:t>
       </w:r>
     </w:p>
     <w:p>
@@ -9589,7 +9680,6 @@
         <w:rPr>
           <w:b/>
         </w:rPr>
-        <w:lastRenderedPageBreak/>
         <w:t xml:space="preserve">Historia Técnica 6: </w:t>
       </w:r>
     </w:p>
@@ -9688,6 +9778,7 @@
         <w:rPr>
           <w:b/>
         </w:rPr>
+        <w:lastRenderedPageBreak/>
         <w:t>Título</w:t>
       </w:r>
       <w:r>
@@ -9956,7 +10047,6 @@
         <w:rPr>
           <w:b/>
         </w:rPr>
-        <w:lastRenderedPageBreak/>
         <w:t>Descripción</w:t>
       </w:r>
       <w:r>
@@ -10038,6 +10128,7 @@
         <w:rPr>
           <w:b/>
         </w:rPr>
+        <w:lastRenderedPageBreak/>
         <w:t>Descripción</w:t>
       </w:r>
       <w:r>
@@ -10187,6 +10278,155 @@
 <file path=word/numbering.xml><?xml version="1.0" encoding="utf-8"?>
 <w:numbering xmlns:wpc="http://schemas.microsoft.com/office/word/2010/wordprocessingCanvas" xmlns:cx="http://schemas.microsoft.com/office/drawing/2014/chartex" xmlns:cx1="http://schemas.microsoft.com/office/drawing/2015/9/8/chartex" xmlns:cx2="http://schemas.microsoft.com/office/drawing/2015/10/21/chartex" xmlns:cx3="http://schemas.microsoft.com/office/drawing/2016/5/9/chartex" xmlns:cx4="http://schemas.microsoft.com/office/drawing/2016/5/10/chartex" xmlns:cx5="http://schemas.microsoft.com/office/drawing/2016/5/11/chartex" xmlns:cx6="http://schemas.microsoft.com/office/drawing/2016/5/12/chartex" xmlns:cx7="http://schemas.microsoft.com/office/drawing/2016/5/13/chartex" xmlns:cx8="http://schemas.microsoft.com/office/drawing/2016/5/14/chartex" xmlns:mc="http://schemas.openxmlformats.org/markup-compatibility/2006" xmlns:aink="http://schemas.microsoft.com/office/drawing/2016/ink" xmlns:am3d="http://schemas.microsoft.com/office/drawing/2017/model3d" xmlns:o="urn:schemas-microsoft-com:office:office" xmlns:oel="http://schemas.microsoft.com/office/2019/extlst" xmlns:r="http://schemas.openxmlformats.org/officeDocument/2006/relationships" xmlns:m="http://schemas.openxmlformats.org/officeDocument/2006/math" xmlns:v="urn:schemas-microsoft-com:vml" xmlns:wp14="http://schemas.microsoft.com/office/word/2010/wordprocessingDrawing" xmlns:wp="http://schemas.openxmlformats.org/drawingml/2006/wordprocessingDrawing" xmlns:w10="urn:schemas-microsoft-com:office:word" xmlns:w="http://schemas.openxmlformats.org/wordprocessingml/2006/main" xmlns:w14="http://schemas.microsoft.com/office/word/2010/wordml" xmlns:w15="http://schemas.microsoft.com/office/word/2012/wordml" xmlns:w16cex="http://schemas.microsoft.com/office/word/2018/wordml/cex" xmlns:w16cid="http://schemas.microsoft.com/office/word/2016/wordml/cid" xmlns:w16="http://schemas.microsoft.com/office/word/2018/wordml" xmlns:w16du="http://schemas.microsoft.com/office/word/2023/wordml/word16du" xmlns:w16sdtdh="http://schemas.microsoft.com/office/word/2020/wordml/sdtdatahash" xmlns:w16se="http://schemas.microsoft.com/office/word/2015/wordml/symex" xmlns:wpg="http://schemas.microsoft.com/office/word/2010/wordprocessingGroup" xmlns:wpi="http://schemas.microsoft.com/office/word/2010/wordprocessingInk" xmlns:wne="http://schemas.microsoft.com/office/word/2006/wordml" xmlns:wps="http://schemas.microsoft.com/office/word/2010/wordprocessingShape" mc:Ignorable="w14 w15 w16se w16cid w16 w16cex w16sdtdh w16du wp14">
   <w:abstractNum w:abstractNumId="0" w15:restartNumberingAfterBreak="0">
+    <w:nsid w:val="10C7529B"/>
+    <w:multiLevelType w:val="multilevel"/>
+    <w:tmpl w:val="A9A6DA84"/>
+    <w:lvl w:ilvl="0">
+      <w:start w:val="1"/>
+      <w:numFmt w:val="bullet"/>
+      <w:lvlText w:val=""/>
+      <w:lvlJc w:val="left"/>
+      <w:pPr>
+        <w:tabs>
+          <w:tab w:val="num" w:pos="720"/>
+        </w:tabs>
+        <w:ind w:left="720" w:hanging="360"/>
+      </w:pPr>
+      <w:rPr>
+        <w:rFonts w:ascii="Symbol" w:hAnsi="Symbol" w:hint="default"/>
+        <w:sz w:val="20"/>
+      </w:rPr>
+    </w:lvl>
+    <w:lvl w:ilvl="1">
+      <w:start w:val="1"/>
+      <w:numFmt w:val="bullet"/>
+      <w:lvlText w:val="o"/>
+      <w:lvlJc w:val="left"/>
+      <w:pPr>
+        <w:tabs>
+          <w:tab w:val="num" w:pos="1440"/>
+        </w:tabs>
+        <w:ind w:left="1440" w:hanging="360"/>
+      </w:pPr>
+      <w:rPr>
+        <w:rFonts w:ascii="Courier New" w:hAnsi="Courier New" w:hint="default"/>
+        <w:sz w:val="20"/>
+      </w:rPr>
+    </w:lvl>
+    <w:lvl w:ilvl="2" w:tentative="1">
+      <w:start w:val="1"/>
+      <w:numFmt w:val="bullet"/>
+      <w:lvlText w:val=""/>
+      <w:lvlJc w:val="left"/>
+      <w:pPr>
+        <w:tabs>
+          <w:tab w:val="num" w:pos="2160"/>
+        </w:tabs>
+        <w:ind w:left="2160" w:hanging="360"/>
+      </w:pPr>
+      <w:rPr>
+        <w:rFonts w:ascii="Wingdings" w:hAnsi="Wingdings" w:hint="default"/>
+        <w:sz w:val="20"/>
+      </w:rPr>
+    </w:lvl>
+    <w:lvl w:ilvl="3" w:tentative="1">
+      <w:start w:val="1"/>
+      <w:numFmt w:val="bullet"/>
+      <w:lvlText w:val=""/>
+      <w:lvlJc w:val="left"/>
+      <w:pPr>
+        <w:tabs>
+          <w:tab w:val="num" w:pos="2880"/>
+        </w:tabs>
+        <w:ind w:left="2880" w:hanging="360"/>
+      </w:pPr>
+      <w:rPr>
+        <w:rFonts w:ascii="Wingdings" w:hAnsi="Wingdings" w:hint="default"/>
+        <w:sz w:val="20"/>
+      </w:rPr>
+    </w:lvl>
+    <w:lvl w:ilvl="4" w:tentative="1">
+      <w:start w:val="1"/>
+      <w:numFmt w:val="bullet"/>
+      <w:lvlText w:val=""/>
+      <w:lvlJc w:val="left"/>
+      <w:pPr>
+        <w:tabs>
+          <w:tab w:val="num" w:pos="3600"/>
+        </w:tabs>
+        <w:ind w:left="3600" w:hanging="360"/>
+      </w:pPr>
+      <w:rPr>
+        <w:rFonts w:ascii="Wingdings" w:hAnsi="Wingdings" w:hint="default"/>
+        <w:sz w:val="20"/>
+      </w:rPr>
+    </w:lvl>
+    <w:lvl w:ilvl="5" w:tentative="1">
+      <w:start w:val="1"/>
+      <w:numFmt w:val="bullet"/>
+      <w:lvlText w:val=""/>
+      <w:lvlJc w:val="left"/>
+      <w:pPr>
+        <w:tabs>
+          <w:tab w:val="num" w:pos="4320"/>
+        </w:tabs>
+        <w:ind w:left="4320" w:hanging="360"/>
+      </w:pPr>
+      <w:rPr>
+        <w:rFonts w:ascii="Wingdings" w:hAnsi="Wingdings" w:hint="default"/>
+        <w:sz w:val="20"/>
+      </w:rPr>
+    </w:lvl>
+    <w:lvl w:ilvl="6" w:tentative="1">
+      <w:start w:val="1"/>
+      <w:numFmt w:val="bullet"/>
+      <w:lvlText w:val=""/>
+      <w:lvlJc w:val="left"/>
+      <w:pPr>
+        <w:tabs>
+          <w:tab w:val="num" w:pos="5040"/>
+        </w:tabs>
+        <w:ind w:left="5040" w:hanging="360"/>
+      </w:pPr>
+      <w:rPr>
+        <w:rFonts w:ascii="Wingdings" w:hAnsi="Wingdings" w:hint="default"/>
+        <w:sz w:val="20"/>
+      </w:rPr>
+    </w:lvl>
+    <w:lvl w:ilvl="7" w:tentative="1">
+      <w:start w:val="1"/>
+      <w:numFmt w:val="bullet"/>
+      <w:lvlText w:val=""/>
+      <w:lvlJc w:val="left"/>
+      <w:pPr>
+        <w:tabs>
+          <w:tab w:val="num" w:pos="5760"/>
+        </w:tabs>
+        <w:ind w:left="5760" w:hanging="360"/>
+      </w:pPr>
+      <w:rPr>
+        <w:rFonts w:ascii="Wingdings" w:hAnsi="Wingdings" w:hint="default"/>
+        <w:sz w:val="20"/>
+      </w:rPr>
+    </w:lvl>
+    <w:lvl w:ilvl="8" w:tentative="1">
+      <w:start w:val="1"/>
+      <w:numFmt w:val="bullet"/>
+      <w:lvlText w:val=""/>
+      <w:lvlJc w:val="left"/>
+      <w:pPr>
+        <w:tabs>
+          <w:tab w:val="num" w:pos="6480"/>
+        </w:tabs>
+        <w:ind w:left="6480" w:hanging="360"/>
+      </w:pPr>
+      <w:rPr>
+        <w:rFonts w:ascii="Wingdings" w:hAnsi="Wingdings" w:hint="default"/>
+        <w:sz w:val="20"/>
+      </w:rPr>
+    </w:lvl>
+  </w:abstractNum>
+  <w:abstractNum w:abstractNumId="1" w15:restartNumberingAfterBreak="0">
     <w:nsid w:val="305A2804"/>
     <w:multiLevelType w:val="hybridMultilevel"/>
     <w:tmpl w:val="D206B5EA"/>
@@ -10398,8 +10638,163 @@
       </w:rPr>
     </w:lvl>
   </w:abstractNum>
+  <w:abstractNum w:abstractNumId="2" w15:restartNumberingAfterBreak="0">
+    <w:nsid w:val="369A5D85"/>
+    <w:multiLevelType w:val="multilevel"/>
+    <w:tmpl w:val="1C52BC30"/>
+    <w:lvl w:ilvl="0">
+      <w:start w:val="1"/>
+      <w:numFmt w:val="bullet"/>
+      <w:lvlText w:val=""/>
+      <w:lvlJc w:val="left"/>
+      <w:pPr>
+        <w:tabs>
+          <w:tab w:val="num" w:pos="720"/>
+        </w:tabs>
+        <w:ind w:left="720" w:hanging="360"/>
+      </w:pPr>
+      <w:rPr>
+        <w:rFonts w:ascii="Symbol" w:hAnsi="Symbol" w:hint="default"/>
+        <w:sz w:val="20"/>
+      </w:rPr>
+    </w:lvl>
+    <w:lvl w:ilvl="1">
+      <w:start w:val="1"/>
+      <w:numFmt w:val="bullet"/>
+      <w:lvlText w:val="o"/>
+      <w:lvlJc w:val="left"/>
+      <w:pPr>
+        <w:tabs>
+          <w:tab w:val="num" w:pos="1440"/>
+        </w:tabs>
+        <w:ind w:left="1440" w:hanging="360"/>
+      </w:pPr>
+      <w:rPr>
+        <w:rFonts w:ascii="Courier New" w:hAnsi="Courier New" w:hint="default"/>
+        <w:sz w:val="20"/>
+      </w:rPr>
+    </w:lvl>
+    <w:lvl w:ilvl="2" w:tentative="1">
+      <w:start w:val="1"/>
+      <w:numFmt w:val="bullet"/>
+      <w:lvlText w:val=""/>
+      <w:lvlJc w:val="left"/>
+      <w:pPr>
+        <w:tabs>
+          <w:tab w:val="num" w:pos="2160"/>
+        </w:tabs>
+        <w:ind w:left="2160" w:hanging="360"/>
+      </w:pPr>
+      <w:rPr>
+        <w:rFonts w:ascii="Wingdings" w:hAnsi="Wingdings" w:hint="default"/>
+        <w:sz w:val="20"/>
+      </w:rPr>
+    </w:lvl>
+    <w:lvl w:ilvl="3" w:tentative="1">
+      <w:start w:val="1"/>
+      <w:numFmt w:val="bullet"/>
+      <w:lvlText w:val=""/>
+      <w:lvlJc w:val="left"/>
+      <w:pPr>
+        <w:tabs>
+          <w:tab w:val="num" w:pos="2880"/>
+        </w:tabs>
+        <w:ind w:left="2880" w:hanging="360"/>
+      </w:pPr>
+      <w:rPr>
+        <w:rFonts w:ascii="Wingdings" w:hAnsi="Wingdings" w:hint="default"/>
+        <w:sz w:val="20"/>
+      </w:rPr>
+    </w:lvl>
+    <w:lvl w:ilvl="4" w:tentative="1">
+      <w:start w:val="1"/>
+      <w:numFmt w:val="bullet"/>
+      <w:lvlText w:val=""/>
+      <w:lvlJc w:val="left"/>
+      <w:pPr>
+        <w:tabs>
+          <w:tab w:val="num" w:pos="3600"/>
+        </w:tabs>
+        <w:ind w:left="3600" w:hanging="360"/>
+      </w:pPr>
+      <w:rPr>
+        <w:rFonts w:ascii="Wingdings" w:hAnsi="Wingdings" w:hint="default"/>
+        <w:sz w:val="20"/>
+      </w:rPr>
+    </w:lvl>
+    <w:lvl w:ilvl="5" w:tentative="1">
+      <w:start w:val="1"/>
+      <w:numFmt w:val="bullet"/>
+      <w:lvlText w:val=""/>
+      <w:lvlJc w:val="left"/>
+      <w:pPr>
+        <w:tabs>
+          <w:tab w:val="num" w:pos="4320"/>
+        </w:tabs>
+        <w:ind w:left="4320" w:hanging="360"/>
+      </w:pPr>
+      <w:rPr>
+        <w:rFonts w:ascii="Wingdings" w:hAnsi="Wingdings" w:hint="default"/>
+        <w:sz w:val="20"/>
+      </w:rPr>
+    </w:lvl>
+    <w:lvl w:ilvl="6" w:tentative="1">
+      <w:start w:val="1"/>
+      <w:numFmt w:val="bullet"/>
+      <w:lvlText w:val=""/>
+      <w:lvlJc w:val="left"/>
+      <w:pPr>
+        <w:tabs>
+          <w:tab w:val="num" w:pos="5040"/>
+        </w:tabs>
+        <w:ind w:left="5040" w:hanging="360"/>
+      </w:pPr>
+      <w:rPr>
+        <w:rFonts w:ascii="Wingdings" w:hAnsi="Wingdings" w:hint="default"/>
+        <w:sz w:val="20"/>
+      </w:rPr>
+    </w:lvl>
+    <w:lvl w:ilvl="7" w:tentative="1">
+      <w:start w:val="1"/>
+      <w:numFmt w:val="bullet"/>
+      <w:lvlText w:val=""/>
+      <w:lvlJc w:val="left"/>
+      <w:pPr>
+        <w:tabs>
+          <w:tab w:val="num" w:pos="5760"/>
+        </w:tabs>
+        <w:ind w:left="5760" w:hanging="360"/>
+      </w:pPr>
+      <w:rPr>
+        <w:rFonts w:ascii="Wingdings" w:hAnsi="Wingdings" w:hint="default"/>
+        <w:sz w:val="20"/>
+      </w:rPr>
+    </w:lvl>
+    <w:lvl w:ilvl="8" w:tentative="1">
+      <w:start w:val="1"/>
+      <w:numFmt w:val="bullet"/>
+      <w:lvlText w:val=""/>
+      <w:lvlJc w:val="left"/>
+      <w:pPr>
+        <w:tabs>
+          <w:tab w:val="num" w:pos="6480"/>
+        </w:tabs>
+        <w:ind w:left="6480" w:hanging="360"/>
+      </w:pPr>
+      <w:rPr>
+        <w:rFonts w:ascii="Wingdings" w:hAnsi="Wingdings" w:hint="default"/>
+        <w:sz w:val="20"/>
+      </w:rPr>
+    </w:lvl>
+  </w:abstractNum>
   <w:num w:numId="1" w16cid:durableId="1146627779">
+    <w:abstractNumId w:val="1"/>
+  </w:num>
+  <w:num w:numId="2" w16cid:durableId="1384715923">
     <w:abstractNumId w:val="0"/>
+  </w:num>
+  <w:num w:numId="3" w16cid:durableId="202181947">
+    <w:abstractNumId w:val="2"/>
   </w:num>
 </w:numbering>
 </file>
@@ -10816,7 +11211,6 @@
   <w:style w:type="character" w:default="1" w:styleId="Fuentedeprrafopredeter">
     <w:name w:val="Default Paragraph Font"/>
     <w:uiPriority w:val="1"/>
-    <w:semiHidden/>
     <w:unhideWhenUsed/>
   </w:style>
   <w:style w:type="table" w:default="1" w:styleId="Tablanormal">
@@ -10853,6 +11247,127 @@
         <w:right w:w="0" w:type="dxa"/>
       </w:tblCellMar>
     </w:tblPr>
+  </w:style>
+  <w:style w:type="table" w:styleId="Tablanormal4">
+    <w:name w:val="Plain Table 4"/>
+    <w:basedOn w:val="Tablanormal"/>
+    <w:uiPriority w:val="44"/>
+    <w:rsid w:val="00ED0128"/>
+    <w:pPr>
+      <w:spacing w:after="0" w:line="240" w:lineRule="auto"/>
+    </w:pPr>
+    <w:tblPr>
+      <w:tblStyleRowBandSize w:val="1"/>
+      <w:tblStyleColBandSize w:val="1"/>
+    </w:tblPr>
+    <w:tblStylePr w:type="firstRow">
+      <w:rPr>
+        <w:b/>
+        <w:bCs/>
+      </w:rPr>
+    </w:tblStylePr>
+    <w:tblStylePr w:type="lastRow">
+      <w:rPr>
+        <w:b/>
+        <w:bCs/>
+      </w:rPr>
+    </w:tblStylePr>
+    <w:tblStylePr w:type="firstCol">
+      <w:rPr>
+        <w:b/>
+        <w:bCs/>
+      </w:rPr>
+    </w:tblStylePr>
+    <w:tblStylePr w:type="lastCol">
+      <w:rPr>
+        <w:b/>
+        <w:bCs/>
+      </w:rPr>
+    </w:tblStylePr>
+    <w:tblStylePr w:type="band1Vert">
+      <w:tblPr/>
+      <w:tcPr>
+        <w:shd w:val="clear" w:color="auto" w:fill="F2F2F2" w:themeFill="background1" w:themeFillShade="F2"/>
+      </w:tcPr>
+    </w:tblStylePr>
+    <w:tblStylePr w:type="band1Horz">
+      <w:tblPr/>
+      <w:tcPr>
+        <w:shd w:val="clear" w:color="auto" w:fill="F2F2F2" w:themeFill="background1" w:themeFillShade="F2"/>
+      </w:tcPr>
+    </w:tblStylePr>
+  </w:style>
+  <w:style w:type="table" w:styleId="Tablaconcuadrcula6concolores-nfasis3">
+    <w:name w:val="Grid Table 6 Colorful Accent 3"/>
+    <w:basedOn w:val="Tablanormal"/>
+    <w:uiPriority w:val="51"/>
+    <w:rsid w:val="00ED0128"/>
+    <w:pPr>
+      <w:spacing w:after="0" w:line="240" w:lineRule="auto"/>
+    </w:pPr>
+    <w:rPr>
+      <w:color w:val="124F1A" w:themeColor="accent3" w:themeShade="BF"/>
+    </w:rPr>
+    <w:tblPr>
+      <w:tblStyleRowBandSize w:val="1"/>
+      <w:tblStyleColBandSize w:val="1"/>
+      <w:tblBorders>
+        <w:top w:val="single" w:sz="4" w:space="0" w:color="47D459" w:themeColor="accent3" w:themeTint="99"/>
+        <w:left w:val="single" w:sz="4" w:space="0" w:color="47D459" w:themeColor="accent3" w:themeTint="99"/>
+        <w:bottom w:val="single" w:sz="4" w:space="0" w:color="47D459" w:themeColor="accent3" w:themeTint="99"/>
+        <w:right w:val="single" w:sz="4" w:space="0" w:color="47D459" w:themeColor="accent3" w:themeTint="99"/>
+        <w:insideH w:val="single" w:sz="4" w:space="0" w:color="47D459" w:themeColor="accent3" w:themeTint="99"/>
+        <w:insideV w:val="single" w:sz="4" w:space="0" w:color="47D459" w:themeColor="accent3" w:themeTint="99"/>
+      </w:tblBorders>
+    </w:tblPr>
+    <w:tblStylePr w:type="firstRow">
+      <w:rPr>
+        <w:b/>
+        <w:bCs/>
+      </w:rPr>
+      <w:tblPr/>
+      <w:tcPr>
+        <w:tcBorders>
+          <w:bottom w:val="single" w:sz="12" w:space="0" w:color="47D459" w:themeColor="accent3" w:themeTint="99"/>
+        </w:tcBorders>
+      </w:tcPr>
+    </w:tblStylePr>
+    <w:tblStylePr w:type="lastRow">
+      <w:rPr>
+        <w:b/>
+        <w:bCs/>
+      </w:rPr>
+      <w:tblPr/>
+      <w:tcPr>
+        <w:tcBorders>
+          <w:top w:val="double" w:sz="4" w:space="0" w:color="47D459" w:themeColor="accent3" w:themeTint="99"/>
+        </w:tcBorders>
+      </w:tcPr>
+    </w:tblStylePr>
+    <w:tblStylePr w:type="firstCol">
+      <w:rPr>
+        <w:b/>
+        <w:bCs/>
+      </w:rPr>
+    </w:tblStylePr>
+    <w:tblStylePr w:type="lastCol">
+      <w:rPr>
+        <w:b/>
+        <w:bCs/>
+      </w:rPr>
+    </w:tblStylePr>
+    <w:tblStylePr w:type="band1Vert">
+      <w:tblPr/>
+      <w:tcPr>
+        <w:shd w:val="clear" w:color="auto" w:fill="C1F0C7" w:themeFill="accent3" w:themeFillTint="33"/>
+      </w:tcPr>
+    </w:tblStylePr>
+    <w:tblStylePr w:type="band1Horz">
+      <w:tblPr/>
+      <w:tcPr>
+        <w:shd w:val="clear" w:color="auto" w:fill="C1F0C7" w:themeFill="accent3" w:themeFillTint="33"/>
+      </w:tcPr>
+    </w:tblStylePr>
   </w:style>
 </w:styles>
 </file>

</xml_diff>